<commit_message>
feat: implement DynamicFormEngine for metadata-driven UI and add document export capabilities
</commit_message>
<xml_diff>
--- a/backend-app/samples/hop_dong.docx
+++ b/backend-app/samples/hop_dong.docx
@@ -107,31 +107,7 @@
           <w:sz w:val="26"/>
           <w:szCs w:val="26"/>
         </w:rPr>
-        <w:t>HĐ số: …/</w:t>
-      </w:r>
-      <w:r>
-        <w:rPr>
-          <w:rFonts w:ascii="Times New Roman" w:hAnsi="Times New Roman"/>
-          <w:sz w:val="26"/>
-          <w:szCs w:val="26"/>
-        </w:rPr>
-        <w:t>…</w:t>
-      </w:r>
-      <w:r>
-        <w:rPr>
-          <w:rFonts w:ascii="Times New Roman" w:hAnsi="Times New Roman"/>
-          <w:sz w:val="26"/>
-          <w:szCs w:val="26"/>
-        </w:rPr>
-        <w:t>-HHKH20</w:t>
-      </w:r>
-      <w:r>
-        <w:rPr>
-          <w:rFonts w:ascii="Times New Roman" w:hAnsi="Times New Roman"/>
-          <w:sz w:val="26"/>
-          <w:szCs w:val="26"/>
-        </w:rPr>
-        <w:t>…</w:t>
+        <w:t>HĐ số: {SoHopDong}</w:t>
       </w:r>
     </w:p>
     <w:p>
@@ -244,56 +220,7 @@
           <w:sz w:val="26"/>
           <w:szCs w:val="26"/>
         </w:rPr>
-        <w:t xml:space="preserve">Hôm nay, ngày </w:t>
-      </w:r>
-      <w:r>
-        <w:rPr>
-          <w:rFonts w:ascii="Times New Roman" w:hAnsi="Times New Roman"/>
-          <w:b/>
-          <w:i/>
-          <w:sz w:val="26"/>
-          <w:szCs w:val="26"/>
-        </w:rPr>
-        <w:t>…</w:t>
-      </w:r>
-      <w:r>
-        <w:rPr>
-          <w:rFonts w:ascii="Times New Roman" w:hAnsi="Times New Roman"/>
-          <w:i/>
-          <w:sz w:val="26"/>
-          <w:szCs w:val="26"/>
-        </w:rPr>
-        <w:t xml:space="preserve"> tháng</w:t>
-      </w:r>
-      <w:r>
-        <w:rPr>
-          <w:rFonts w:ascii="Times New Roman" w:hAnsi="Times New Roman"/>
-          <w:b/>
-          <w:bCs/>
-          <w:i/>
-          <w:sz w:val="26"/>
-          <w:szCs w:val="26"/>
-        </w:rPr>
-        <w:t xml:space="preserve"> …</w:t>
-      </w:r>
-      <w:r>
-        <w:rPr>
-          <w:rFonts w:ascii="Times New Roman" w:hAnsi="Times New Roman"/>
-          <w:i/>
-          <w:sz w:val="26"/>
-          <w:szCs w:val="26"/>
-        </w:rPr>
-        <w:t xml:space="preserve"> năm </w:t>
-      </w:r>
-      <w:r>
-        <w:rPr>
-          <w:rFonts w:ascii="Times New Roman" w:hAnsi="Times New Roman"/>
-          <w:b/>
-          <w:i/>
-          <w:sz w:val="26"/>
-          <w:szCs w:val="26"/>
-        </w:rPr>
-        <w:t>2025</w:t>
+        <w:t xml:space="preserve">Hôm nay, ngày {NgayLapHD} tháng {ThangLapHD} năm {NamLapHD}</w:t>
       </w:r>
       <w:r>
         <w:rPr>
@@ -499,7 +426,7 @@
           <w:sz w:val="26"/>
           <w:szCs w:val="26"/>
         </w:rPr>
-        <w:t>Điện thoại</w:t>
+        <w:t>Điện thoại: {BenB_DienThoai}: {BenB_DienThoai}</w:t>
       </w:r>
       <w:r>
         <w:rPr>
@@ -631,7 +558,7 @@
           <w:sz w:val="26"/>
           <w:szCs w:val="26"/>
         </w:rPr>
-        <w:t xml:space="preserve">Nhân viên Phụ Trách: </w:t>
+        <w:t xml:space="preserve">Nhân viên Phụ Trách: {BenA_NhanVienPhuTrach} </w:t>
       </w:r>
       <w:r>
         <w:rPr>
@@ -684,7 +611,7 @@
           <w:sz w:val="26"/>
           <w:szCs w:val="26"/>
         </w:rPr>
-        <w:t xml:space="preserve">Số ĐT: </w:t>
+        <w:t xml:space="preserve">Số ĐT: {BenA_SDT_NhanVien} </w:t>
       </w:r>
     </w:p>
     <w:p>
@@ -765,7 +692,7 @@
           <w:sz w:val="26"/>
           <w:szCs w:val="26"/>
         </w:rPr>
-        <w:t>Tên đại diện</w:t>
+        <w:t>Tên đại diện: {BenB_TenDaiDien}: {BenB_TenDaiDien}</w:t>
       </w:r>
       <w:r>
         <w:rPr>
@@ -795,7 +722,7 @@
           <w:sz w:val="26"/>
           <w:szCs w:val="26"/>
         </w:rPr>
-        <w:t>Tên Chủ Tiệc</w:t>
+        <w:t>Tên Chủ Tiệc: {BenB_TenChuTiec}: {BenB_TenChuTiec}</w:t>
       </w:r>
       <w:r>
         <w:rPr>
@@ -833,7 +760,7 @@
           <w:sz w:val="26"/>
           <w:szCs w:val="26"/>
         </w:rPr>
-        <w:t>CCCD</w:t>
+        <w:t>CCCD: {BenB_CCCD}: {BenB_CCCD: {BenB_CCCD}}</w:t>
       </w:r>
       <w:r>
         <w:rPr>
@@ -880,7 +807,7 @@
           <w:sz w:val="26"/>
           <w:szCs w:val="26"/>
         </w:rPr>
-        <w:t>Địa chỉ</w:t>
+        <w:t>Địa chỉ: {BenB_DiaChi}: {BenB_DiaChi}</w:t>
       </w:r>
       <w:r>
         <w:rPr>
@@ -924,7 +851,7 @@
           <w:sz w:val="26"/>
           <w:szCs w:val="26"/>
         </w:rPr>
-        <w:t>Điện thoại</w:t>
+        <w:t>Điện thoại: {BenB_DienThoai}: {BenB_DienThoai}</w:t>
       </w:r>
       <w:r>
         <w:rPr>
@@ -1104,330 +1031,225 @@
           <w:sz w:val="26"/>
           <w:szCs w:val="26"/>
         </w:rPr>
-        <w:t>Ngày tiệc: Vào lúc</w:t>
-      </w:r>
-      <w:r>
-        <w:rPr>
-          <w:rFonts w:ascii="Times New Roman" w:hAnsi="Times New Roman"/>
-          <w:sz w:val="26"/>
-          <w:szCs w:val="26"/>
-        </w:rPr>
-        <w:t>………</w:t>
-      </w:r>
-      <w:proofErr w:type="gramStart"/>
-      <w:r>
-        <w:rPr>
-          <w:rFonts w:ascii="Times New Roman" w:hAnsi="Times New Roman"/>
-          <w:sz w:val="26"/>
-          <w:szCs w:val="26"/>
-        </w:rPr>
-        <w:t>…..</w:t>
+        <w:t>Ngày tiệc: Vào lúc {Tiec_GioBatDau}, ngày {Tiec_NgayDL} tháng {Tiec_ThangDL} năm {Tiec_NamDL} (Dương lịch)</w:t>
+      </w:r>
+    </w:p>
+    <w:p>
+      <w:pPr>
+        <w:pStyle w:val="c"/>
+        <w:spacing w:before="120" w:after="120" w:line="360" w:lineRule="auto"/>
+        <w:ind w:leftChars="-100" w:left="-220" w:firstLine="0"/>
+        <w:rPr>
+          <w:rFonts w:ascii="Times New Roman" w:hAnsi="Times New Roman"/>
+          <w:sz w:val="26"/>
+          <w:szCs w:val="26"/>
+        </w:rPr>
+      </w:pPr>
+      <w:r>
+        <w:rPr>
+          <w:rFonts w:ascii="Times New Roman" w:hAnsi="Times New Roman"/>
+          <w:sz w:val="26"/>
+          <w:szCs w:val="26"/>
+        </w:rPr>
+        <w:t>Nhằm ngày {Tiec_NgayAL} tháng {Tiec_ThangAL} năm {Tiec_NamAL} (Âm lịch)     </w:t>
+      </w:r>
+    </w:p>
+    <w:p>
+      <w:pPr>
+        <w:spacing w:before="120" w:after="120" w:line="360" w:lineRule="auto"/>
+        <w:ind w:leftChars="-100" w:left="-220"/>
+        <w:jc w:val="both"/>
+        <w:rPr>
+          <w:rFonts w:ascii="Times New Roman" w:hAnsi="Times New Roman"/>
+          <w:b/>
+          <w:sz w:val="26"/>
+          <w:szCs w:val="26"/>
+        </w:rPr>
+      </w:pPr>
+      <w:r>
+        <w:rPr>
+          <w:rFonts w:ascii="Times New Roman" w:hAnsi="Times New Roman"/>
+          <w:sz w:val="26"/>
+          <w:szCs w:val="26"/>
+        </w:rPr>
+        <w:t xml:space="preserve">Sảnh tiệc: {Tiec_SanhTiec}</w:t>
+      </w:r>
+    </w:p>
+    <w:p>
+      <w:pPr>
+        <w:spacing w:before="120" w:after="120" w:line="360" w:lineRule="auto"/>
+        <w:ind w:leftChars="-100" w:left="-220"/>
+        <w:jc w:val="both"/>
+        <w:rPr>
+          <w:rFonts w:ascii="Times New Roman" w:hAnsi="Times New Roman"/>
+          <w:sz w:val="26"/>
+          <w:szCs w:val="26"/>
+        </w:rPr>
+      </w:pPr>
+      <w:r>
+        <w:rPr>
+          <w:rFonts w:ascii="Times New Roman" w:hAnsi="Times New Roman"/>
+          <w:bCs/>
+          <w:sz w:val="26"/>
+          <w:szCs w:val="26"/>
+        </w:rPr>
+        <w:t xml:space="preserve"> </w:t>
+      </w:r>
+      <w:r>
+        <w:rPr>
+          <w:rFonts w:ascii="Times New Roman" w:hAnsi="Times New Roman"/>
+          <w:bCs/>
+          <w:sz w:val="26"/>
+          <w:szCs w:val="26"/>
+        </w:rPr>
+        <w:t>Quy mô phục vụ của sảnh: từ {Sanh_QuyMoMin} bàn đến {Sanh_QuyMoMax} bàn</w:t>
       </w:r>
       <w:proofErr w:type="gramEnd"/>
-      <w:r>
-        <w:rPr>
-          <w:rFonts w:ascii="Times New Roman" w:hAnsi="Times New Roman"/>
-          <w:sz w:val="26"/>
-          <w:szCs w:val="26"/>
-        </w:rPr>
-        <w:t>, ngày ….</w:t>
-      </w:r>
-      <w:r>
-        <w:rPr>
-          <w:rFonts w:ascii="Times New Roman" w:hAnsi="Times New Roman"/>
-          <w:b/>
+    </w:p>
+    <w:p>
+      <w:pPr>
+        <w:spacing w:before="120" w:after="120" w:line="360" w:lineRule="auto"/>
+        <w:ind w:leftChars="-100" w:left="-220"/>
+        <w:jc w:val="both"/>
+        <w:rPr>
+          <w:rFonts w:ascii="Times New Roman" w:hAnsi="Times New Roman"/>
+          <w:sz w:val="26"/>
+          <w:szCs w:val="26"/>
+        </w:rPr>
+      </w:pPr>
+      <w:r>
+        <w:rPr>
+          <w:rFonts w:ascii="Times New Roman" w:hAnsi="Times New Roman"/>
+          <w:sz w:val="26"/>
+          <w:szCs w:val="26"/>
+        </w:rPr>
+        <w:t>Các dịch vụ, đơn giá, số lượng bàn tiệc, chương trình khuyến mại và các nội dung liên quan khác được quy định chi tiết tại các điều khoản và phụ lục kèm theo Hợp đồng này.</w:t>
+      </w:r>
+    </w:p>
+    <w:p>
+      <w:pPr>
+        <w:spacing w:before="120" w:after="120" w:line="360" w:lineRule="auto"/>
+        <w:ind w:leftChars="-100" w:left="-220"/>
+        <w:jc w:val="both"/>
+        <w:rPr>
+          <w:rFonts w:ascii="Times New Roman" w:hAnsi="Times New Roman"/>
+          <w:b/>
+          <w:sz w:val="26"/>
+          <w:szCs w:val="26"/>
+        </w:rPr>
+      </w:pPr>
+      <w:r>
+        <w:rPr>
+          <w:rFonts w:ascii="Times New Roman" w:hAnsi="Times New Roman"/>
+          <w:b/>
+          <w:sz w:val="26"/>
+          <w:szCs w:val="26"/>
+          <w:u w:val="single"/>
+        </w:rPr>
+        <w:t>ĐIÊU 2</w:t>
+      </w:r>
+      <w:r>
+        <w:rPr>
+          <w:rFonts w:ascii="Times New Roman" w:hAnsi="Times New Roman"/>
+          <w:b/>
+          <w:sz w:val="26"/>
+          <w:szCs w:val="26"/>
+        </w:rPr>
+        <w:t>: QUY MÔ TIỆC</w:t>
+      </w:r>
+    </w:p>
+    <w:p>
+      <w:pPr>
+        <w:spacing w:before="120" w:after="120" w:line="360" w:lineRule="auto"/>
+        <w:ind w:leftChars="-100" w:left="-220"/>
+        <w:jc w:val="both"/>
+        <w:rPr>
+          <w:rFonts w:ascii="Times New Roman" w:hAnsi="Times New Roman"/>
+          <w:sz w:val="26"/>
+          <w:szCs w:val="26"/>
+        </w:rPr>
+      </w:pPr>
+      <w:r>
+        <w:rPr>
+          <w:rFonts w:ascii="Times New Roman" w:hAnsi="Times New Roman"/>
+          <w:sz w:val="26"/>
+          <w:szCs w:val="26"/>
+        </w:rPr>
+        <w:t>2.1. Tại thời điểm ký hợp đồng, Bên B yêu cầu Bên A tổ chức tiệc nêu trên với quy mô cụ thể như sau:</w:t>
+      </w:r>
+    </w:p>
+    <w:p>
+      <w:pPr>
+        <w:spacing w:before="120" w:after="120" w:line="360" w:lineRule="auto"/>
+        <w:ind w:leftChars="-100" w:left="-220"/>
+        <w:jc w:val="both"/>
+        <w:rPr>
+          <w:rFonts w:ascii="Times New Roman" w:hAnsi="Times New Roman"/>
+          <w:sz w:val="26"/>
+          <w:szCs w:val="26"/>
+        </w:rPr>
+      </w:pPr>
+      <w:r>
+        <w:rPr>
+          <w:rFonts w:ascii="Times New Roman" w:hAnsi="Times New Roman"/>
+          <w:sz w:val="26"/>
+          <w:szCs w:val="26"/>
+        </w:rPr>
+        <w:tab/>
+        <w:t xml:space="preserve">Số bàn tiệc chính thức: {Tiec_SoBanChinhThuc} {Tiec_SoBanChinhThuc} </w:t>
+      </w:r>
+    </w:p>
+    <w:p>
+      <w:pPr>
+        <w:spacing w:before="120" w:after="120" w:line="360" w:lineRule="auto"/>
+        <w:ind w:leftChars="-100" w:left="-220"/>
+        <w:jc w:val="both"/>
+        <w:rPr>
+          <w:rFonts w:ascii="Times New Roman" w:hAnsi="Times New Roman"/>
+          <w:sz w:val="26"/>
+          <w:szCs w:val="26"/>
+        </w:rPr>
+      </w:pPr>
+      <w:r>
+        <w:rPr>
+          <w:rFonts w:ascii="Times New Roman" w:hAnsi="Times New Roman"/>
+          <w:sz w:val="26"/>
+          <w:szCs w:val="26"/>
+        </w:rPr>
+        <w:tab/>
+        <w:t xml:space="preserve">Số lượng bàn tặng: {Tiec_SoBanTang}      {Tiec_SoBanTang} </w:t>
+      </w:r>
+    </w:p>
+    <w:p>
+      <w:pPr>
+        <w:spacing w:before="120" w:after="120" w:line="360" w:lineRule="auto"/>
+        <w:ind w:leftChars="-100" w:left="-220"/>
+        <w:jc w:val="both"/>
+        <w:rPr>
+          <w:rFonts w:ascii="Times New Roman" w:hAnsi="Times New Roman"/>
+          <w:sz w:val="26"/>
+          <w:szCs w:val="26"/>
+        </w:rPr>
+      </w:pPr>
+      <w:r>
+        <w:rPr>
+          <w:rFonts w:ascii="Times New Roman" w:hAnsi="Times New Roman"/>
+          <w:sz w:val="26"/>
+          <w:szCs w:val="26"/>
+        </w:rPr>
+        <w:tab/>
+        <w:t>Số lượng bàn dự phòng: {Tiec_SoBanDuPhong}  {Tiec_SoBanDuPhong}</w:t>
+      </w:r>
+      <w:r>
+        <w:rPr>
+          <w:rFonts w:ascii="Times New Roman" w:hAnsi="Times New Roman"/>
+          <w:b/>
+          <w:bCs/>
           <w:sz w:val="26"/>
           <w:szCs w:val="26"/>
         </w:rPr>
         <w:t xml:space="preserve"> </w:t>
       </w:r>
-      <w:r>
-        <w:rPr>
-          <w:rFonts w:ascii="Times New Roman" w:hAnsi="Times New Roman"/>
-          <w:sz w:val="26"/>
-          <w:szCs w:val="26"/>
-        </w:rPr>
-        <w:t>tháng….</w:t>
-      </w:r>
-      <w:r>
-        <w:rPr>
-          <w:rFonts w:ascii="Times New Roman" w:hAnsi="Times New Roman"/>
-          <w:b/>
-          <w:sz w:val="26"/>
-          <w:szCs w:val="26"/>
-        </w:rPr>
-        <w:t xml:space="preserve"> </w:t>
-      </w:r>
-      <w:r>
-        <w:rPr>
-          <w:rFonts w:ascii="Times New Roman" w:hAnsi="Times New Roman"/>
-          <w:sz w:val="26"/>
-          <w:szCs w:val="26"/>
-        </w:rPr>
-        <w:t>N</w:t>
-      </w:r>
-      <w:r>
-        <w:rPr>
-          <w:rFonts w:ascii="Times New Roman" w:hAnsi="Times New Roman"/>
-          <w:sz w:val="26"/>
-          <w:szCs w:val="26"/>
-        </w:rPr>
-        <w:t>ăm</w:t>
-      </w:r>
-      <w:r>
-        <w:rPr>
-          <w:rFonts w:ascii="Times New Roman" w:hAnsi="Times New Roman"/>
-          <w:sz w:val="26"/>
-          <w:szCs w:val="26"/>
-        </w:rPr>
-        <w:t>…</w:t>
-      </w:r>
-      <w:proofErr w:type="gramStart"/>
-      <w:r>
-        <w:rPr>
-          <w:rFonts w:ascii="Times New Roman" w:hAnsi="Times New Roman"/>
-          <w:sz w:val="26"/>
-          <w:szCs w:val="26"/>
-        </w:rPr>
-        <w:t>….</w:t>
-      </w:r>
-      <w:r>
-        <w:rPr>
-          <w:rFonts w:ascii="Times New Roman" w:hAnsi="Times New Roman"/>
-          <w:sz w:val="26"/>
-          <w:szCs w:val="26"/>
-        </w:rPr>
-        <w:t>(</w:t>
-      </w:r>
-      <w:proofErr w:type="gramEnd"/>
-      <w:r>
-        <w:rPr>
-          <w:rFonts w:ascii="Times New Roman" w:hAnsi="Times New Roman"/>
-          <w:sz w:val="26"/>
-          <w:szCs w:val="26"/>
-        </w:rPr>
-        <w:t>Dương lịch)</w:t>
-      </w:r>
-    </w:p>
-    <w:p>
-      <w:pPr>
-        <w:pStyle w:val="c"/>
-        <w:spacing w:before="120" w:after="120" w:line="360" w:lineRule="auto"/>
-        <w:ind w:leftChars="-100" w:left="-220" w:firstLine="0"/>
-        <w:rPr>
-          <w:rFonts w:ascii="Times New Roman" w:hAnsi="Times New Roman"/>
-          <w:sz w:val="26"/>
-          <w:szCs w:val="26"/>
-        </w:rPr>
-      </w:pPr>
-      <w:r>
-        <w:rPr>
-          <w:rFonts w:ascii="Times New Roman" w:hAnsi="Times New Roman"/>
-          <w:sz w:val="26"/>
-          <w:szCs w:val="26"/>
-        </w:rPr>
-        <w:t>Nhằm ngày….</w:t>
-      </w:r>
-      <w:r>
-        <w:rPr>
-          <w:rFonts w:ascii="Times New Roman" w:hAnsi="Times New Roman"/>
-          <w:i/>
-          <w:sz w:val="26"/>
-          <w:szCs w:val="26"/>
-        </w:rPr>
-        <w:t xml:space="preserve"> </w:t>
-      </w:r>
-      <w:r>
-        <w:rPr>
-          <w:rFonts w:ascii="Times New Roman" w:hAnsi="Times New Roman"/>
-          <w:sz w:val="26"/>
-          <w:szCs w:val="26"/>
-        </w:rPr>
-        <w:t>tháng … năm</w:t>
-      </w:r>
-      <w:r>
-        <w:rPr>
-          <w:rFonts w:ascii="Times New Roman" w:hAnsi="Times New Roman"/>
-          <w:sz w:val="26"/>
-          <w:szCs w:val="26"/>
-        </w:rPr>
-        <w:t>…….</w:t>
-      </w:r>
-      <w:r>
-        <w:rPr>
-          <w:rFonts w:ascii="Times New Roman" w:hAnsi="Times New Roman"/>
-          <w:sz w:val="26"/>
-          <w:szCs w:val="26"/>
-        </w:rPr>
-        <w:t xml:space="preserve"> (Âm lịch)     </w:t>
-      </w:r>
-    </w:p>
-    <w:p>
-      <w:pPr>
-        <w:spacing w:before="120" w:after="120" w:line="360" w:lineRule="auto"/>
-        <w:ind w:leftChars="-100" w:left="-220"/>
-        <w:jc w:val="both"/>
-        <w:rPr>
-          <w:rFonts w:ascii="Times New Roman" w:hAnsi="Times New Roman"/>
-          <w:b/>
-          <w:sz w:val="26"/>
-          <w:szCs w:val="26"/>
-        </w:rPr>
-      </w:pPr>
-      <w:r>
-        <w:rPr>
-          <w:rFonts w:ascii="Times New Roman" w:hAnsi="Times New Roman"/>
-          <w:sz w:val="26"/>
-          <w:szCs w:val="26"/>
-        </w:rPr>
-        <w:t xml:space="preserve">Sảnh tiệc: </w:t>
-      </w:r>
-      <w:r>
-        <w:rPr>
-          <w:rFonts w:ascii="Times New Roman" w:hAnsi="Times New Roman"/>
-          <w:sz w:val="26"/>
-          <w:szCs w:val="26"/>
-        </w:rPr>
-        <w:t>………</w:t>
-      </w:r>
-    </w:p>
-    <w:p>
-      <w:pPr>
-        <w:spacing w:before="120" w:after="120" w:line="360" w:lineRule="auto"/>
-        <w:ind w:leftChars="-100" w:left="-220"/>
-        <w:jc w:val="both"/>
-        <w:rPr>
-          <w:rFonts w:ascii="Times New Roman" w:hAnsi="Times New Roman"/>
-          <w:sz w:val="26"/>
-          <w:szCs w:val="26"/>
-        </w:rPr>
-      </w:pPr>
-      <w:r>
-        <w:rPr>
-          <w:rFonts w:ascii="Times New Roman" w:hAnsi="Times New Roman"/>
-          <w:bCs/>
-          <w:sz w:val="26"/>
-          <w:szCs w:val="26"/>
-        </w:rPr>
-        <w:t xml:space="preserve"> </w:t>
-      </w:r>
-      <w:r>
-        <w:rPr>
-          <w:rFonts w:ascii="Times New Roman" w:hAnsi="Times New Roman"/>
-          <w:bCs/>
-          <w:sz w:val="26"/>
-          <w:szCs w:val="26"/>
-        </w:rPr>
-        <w:t>Quy mô phục vụ của sảnh:</w:t>
-      </w:r>
-      <w:r>
-        <w:rPr>
-          <w:rFonts w:ascii="Times New Roman" w:hAnsi="Times New Roman"/>
-          <w:sz w:val="26"/>
-          <w:szCs w:val="26"/>
-        </w:rPr>
-        <w:t xml:space="preserve"> từ </w:t>
-      </w:r>
-      <w:proofErr w:type="gramStart"/>
-      <w:r>
-        <w:rPr>
-          <w:rFonts w:ascii="Times New Roman" w:hAnsi="Times New Roman"/>
-          <w:sz w:val="26"/>
-          <w:szCs w:val="26"/>
-        </w:rPr>
-        <w:t>….bàn</w:t>
-      </w:r>
-      <w:proofErr w:type="gramEnd"/>
-      <w:r>
-        <w:rPr>
-          <w:rFonts w:ascii="Times New Roman" w:hAnsi="Times New Roman"/>
-          <w:sz w:val="26"/>
-          <w:szCs w:val="26"/>
-        </w:rPr>
-        <w:t xml:space="preserve"> đến </w:t>
-      </w:r>
-      <w:proofErr w:type="gramStart"/>
-      <w:r>
-        <w:rPr>
-          <w:rFonts w:ascii="Times New Roman" w:hAnsi="Times New Roman"/>
-          <w:sz w:val="26"/>
-          <w:szCs w:val="26"/>
-        </w:rPr>
-        <w:t>….bàn</w:t>
-      </w:r>
-      <w:proofErr w:type="gramEnd"/>
-    </w:p>
-    <w:p>
-      <w:pPr>
-        <w:spacing w:before="120" w:after="120" w:line="360" w:lineRule="auto"/>
-        <w:ind w:leftChars="-100" w:left="-220"/>
-        <w:jc w:val="both"/>
-        <w:rPr>
-          <w:rFonts w:ascii="Times New Roman" w:hAnsi="Times New Roman"/>
-          <w:sz w:val="26"/>
-          <w:szCs w:val="26"/>
-        </w:rPr>
-      </w:pPr>
-      <w:r>
-        <w:rPr>
-          <w:rFonts w:ascii="Times New Roman" w:hAnsi="Times New Roman"/>
-          <w:sz w:val="26"/>
-          <w:szCs w:val="26"/>
-        </w:rPr>
-        <w:t>Các dịch vụ, đơn giá, số lượng bàn tiệc, chương trình khuyến mại và các nội dung liên quan khác được quy định chi tiết tại các điều khoản và phụ lục kèm theo Hợp đồng này.</w:t>
-      </w:r>
-    </w:p>
-    <w:p>
-      <w:pPr>
-        <w:spacing w:before="120" w:after="120" w:line="360" w:lineRule="auto"/>
-        <w:ind w:leftChars="-100" w:left="-220"/>
-        <w:jc w:val="both"/>
-        <w:rPr>
-          <w:rFonts w:ascii="Times New Roman" w:hAnsi="Times New Roman"/>
-          <w:b/>
-          <w:sz w:val="26"/>
-          <w:szCs w:val="26"/>
-        </w:rPr>
-      </w:pPr>
-      <w:r>
-        <w:rPr>
-          <w:rFonts w:ascii="Times New Roman" w:hAnsi="Times New Roman"/>
-          <w:b/>
-          <w:sz w:val="26"/>
-          <w:szCs w:val="26"/>
-          <w:u w:val="single"/>
-        </w:rPr>
-        <w:t>ĐIÊU 2</w:t>
-      </w:r>
-      <w:r>
-        <w:rPr>
-          <w:rFonts w:ascii="Times New Roman" w:hAnsi="Times New Roman"/>
-          <w:b/>
-          <w:sz w:val="26"/>
-          <w:szCs w:val="26"/>
-        </w:rPr>
-        <w:t>: QUY MÔ TIỆC</w:t>
-      </w:r>
-    </w:p>
-    <w:p>
-      <w:pPr>
-        <w:spacing w:before="120" w:after="120" w:line="360" w:lineRule="auto"/>
-        <w:ind w:leftChars="-100" w:left="-220"/>
-        <w:jc w:val="both"/>
-        <w:rPr>
-          <w:rFonts w:ascii="Times New Roman" w:hAnsi="Times New Roman"/>
-          <w:sz w:val="26"/>
-          <w:szCs w:val="26"/>
-        </w:rPr>
-      </w:pPr>
-      <w:r>
-        <w:rPr>
-          <w:rFonts w:ascii="Times New Roman" w:hAnsi="Times New Roman"/>
-          <w:sz w:val="26"/>
-          <w:szCs w:val="26"/>
-        </w:rPr>
-        <w:t>2.1. Tại thời điểm ký hợp đồng, Bên B yêu cầu Bên A tổ chức tiệc nêu trên với quy mô cụ thể như sau:</w:t>
-      </w:r>
     </w:p>
     <w:p>
       <w:pPr>
@@ -1447,80 +1269,7 @@
           <w:szCs w:val="26"/>
         </w:rPr>
         <w:tab/>
-        <w:t xml:space="preserve">Số bàn tiệc chính thức: </w:t>
-      </w:r>
-    </w:p>
-    <w:p>
-      <w:pPr>
-        <w:spacing w:before="120" w:after="120" w:line="360" w:lineRule="auto"/>
-        <w:ind w:leftChars="-100" w:left="-220"/>
-        <w:jc w:val="both"/>
-        <w:rPr>
-          <w:rFonts w:ascii="Times New Roman" w:hAnsi="Times New Roman"/>
-          <w:sz w:val="26"/>
-          <w:szCs w:val="26"/>
-        </w:rPr>
-      </w:pPr>
-      <w:r>
-        <w:rPr>
-          <w:rFonts w:ascii="Times New Roman" w:hAnsi="Times New Roman"/>
-          <w:sz w:val="26"/>
-          <w:szCs w:val="26"/>
-        </w:rPr>
-        <w:tab/>
-        <w:t xml:space="preserve">Số lượng bàn tặng: </w:t>
-      </w:r>
-    </w:p>
-    <w:p>
-      <w:pPr>
-        <w:spacing w:before="120" w:after="120" w:line="360" w:lineRule="auto"/>
-        <w:ind w:leftChars="-100" w:left="-220"/>
-        <w:jc w:val="both"/>
-        <w:rPr>
-          <w:rFonts w:ascii="Times New Roman" w:hAnsi="Times New Roman"/>
-          <w:sz w:val="26"/>
-          <w:szCs w:val="26"/>
-        </w:rPr>
-      </w:pPr>
-      <w:r>
-        <w:rPr>
-          <w:rFonts w:ascii="Times New Roman" w:hAnsi="Times New Roman"/>
-          <w:sz w:val="26"/>
-          <w:szCs w:val="26"/>
-        </w:rPr>
-        <w:tab/>
-        <w:t>Số lượng bàn dự phòng:</w:t>
-      </w:r>
-      <w:r>
-        <w:rPr>
-          <w:rFonts w:ascii="Times New Roman" w:hAnsi="Times New Roman"/>
-          <w:b/>
-          <w:bCs/>
-          <w:sz w:val="26"/>
-          <w:szCs w:val="26"/>
-        </w:rPr>
-        <w:t xml:space="preserve"> </w:t>
-      </w:r>
-    </w:p>
-    <w:p>
-      <w:pPr>
-        <w:spacing w:before="120" w:after="120" w:line="360" w:lineRule="auto"/>
-        <w:ind w:leftChars="-100" w:left="-220"/>
-        <w:jc w:val="both"/>
-        <w:rPr>
-          <w:rFonts w:ascii="Times New Roman" w:hAnsi="Times New Roman"/>
-          <w:sz w:val="26"/>
-          <w:szCs w:val="26"/>
-        </w:rPr>
-      </w:pPr>
-      <w:r>
-        <w:rPr>
-          <w:rFonts w:ascii="Times New Roman" w:hAnsi="Times New Roman"/>
-          <w:sz w:val="26"/>
-          <w:szCs w:val="26"/>
-        </w:rPr>
-        <w:tab/>
-        <w:t xml:space="preserve">Số khách trong một bàn: </w:t>
+        <w:t xml:space="preserve">Số khách trong một bàn: {Tiec_SoKhach1Ban} {Tiec_SoKhach1Ban} </w:t>
       </w:r>
     </w:p>
     <w:p>
@@ -2617,56 +2366,27 @@
           <w:sz w:val="26"/>
           <w:szCs w:val="26"/>
         </w:rPr>
-        <w:t>là</w:t>
-      </w:r>
-      <w:r>
-        <w:rPr>
-          <w:rFonts w:ascii="Times New Roman" w:hAnsi="Times New Roman"/>
-          <w:b w:val="0"/>
-          <w:bCs/>
-          <w:sz w:val="26"/>
-          <w:szCs w:val="26"/>
-        </w:rPr>
-        <w:t>:</w:t>
-      </w:r>
-      <w:r>
-        <w:rPr>
-          <w:rFonts w:ascii="Times New Roman" w:hAnsi="Times New Roman"/>
-          <w:b w:val="0"/>
+        <w:t>là: {Coc_Lan1_SoTien} VNĐ</w:t>
+      </w:r>
+      <w:proofErr w:type="gramEnd"/>
+      <w:r>
+        <w:rPr>
+          <w:rFonts w:ascii="Times New Roman" w:hAnsi="Times New Roman"/>
           <w:bCs/>
           <w:sz w:val="26"/>
           <w:szCs w:val="26"/>
         </w:rPr>
         <w:t xml:space="preserve"> </w:t>
       </w:r>
-      <w:proofErr w:type="gramStart"/>
-      <w:r>
-        <w:rPr>
-          <w:rFonts w:ascii="Times New Roman" w:hAnsi="Times New Roman"/>
-          <w:sz w:val="26"/>
-          <w:szCs w:val="26"/>
-        </w:rPr>
-        <w:t>…</w:t>
-      </w:r>
-      <w:r>
-        <w:rPr>
-          <w:rFonts w:ascii="Times New Roman" w:hAnsi="Times New Roman"/>
-          <w:bCs/>
-          <w:sz w:val="26"/>
-          <w:szCs w:val="26"/>
-        </w:rPr>
-        <w:t>.</w:t>
-      </w:r>
-      <w:r>
-        <w:rPr>
-          <w:rFonts w:ascii="Times New Roman" w:hAnsi="Times New Roman"/>
-          <w:bCs/>
-          <w:sz w:val="26"/>
-          <w:szCs w:val="26"/>
-        </w:rPr>
-        <w:t>VNĐ</w:t>
-      </w:r>
-      <w:proofErr w:type="gramEnd"/>
+      <w:r>
+        <w:rPr>
+          <w:rFonts w:ascii="Times New Roman" w:hAnsi="Times New Roman"/>
+          <w:bCs/>
+          <w:sz w:val="26"/>
+          <w:szCs w:val="26"/>
+        </w:rPr>
+        <w:t xml:space="preserve">(Bằng chữ: {Coc_Lan1_BangChu})</w:t>
+      </w:r>
       <w:r>
         <w:rPr>
           <w:rFonts w:ascii="Times New Roman" w:hAnsi="Times New Roman"/>
@@ -2679,118 +2399,12 @@
       <w:r>
         <w:rPr>
           <w:rFonts w:ascii="Times New Roman" w:hAnsi="Times New Roman"/>
-          <w:bCs/>
-          <w:sz w:val="26"/>
-          <w:szCs w:val="26"/>
-        </w:rPr>
-        <w:t xml:space="preserve">(Bằng </w:t>
-      </w:r>
-      <w:proofErr w:type="gramStart"/>
-      <w:r>
-        <w:rPr>
-          <w:rFonts w:ascii="Times New Roman" w:hAnsi="Times New Roman"/>
-          <w:bCs/>
-          <w:sz w:val="26"/>
-          <w:szCs w:val="26"/>
-        </w:rPr>
-        <w:t>chữ:…</w:t>
-      </w:r>
-      <w:proofErr w:type="gramEnd"/>
-      <w:r>
-        <w:rPr>
-          <w:rFonts w:ascii="Times New Roman" w:hAnsi="Times New Roman"/>
-          <w:bCs/>
-          <w:sz w:val="26"/>
-          <w:szCs w:val="26"/>
-        </w:rPr>
-        <w:t>…</w:t>
-      </w:r>
-      <w:proofErr w:type="gramStart"/>
-      <w:r>
-        <w:rPr>
-          <w:rFonts w:ascii="Times New Roman" w:hAnsi="Times New Roman"/>
-          <w:bCs/>
-          <w:sz w:val="26"/>
-          <w:szCs w:val="26"/>
-        </w:rPr>
-        <w:t>…..</w:t>
-      </w:r>
-      <w:proofErr w:type="gramEnd"/>
-      <w:r>
-        <w:rPr>
-          <w:rFonts w:ascii="Times New Roman" w:hAnsi="Times New Roman"/>
-          <w:bCs/>
-          <w:sz w:val="26"/>
-          <w:szCs w:val="26"/>
-        </w:rPr>
-        <w:t>)</w:t>
-      </w:r>
-      <w:r>
-        <w:rPr>
-          <w:rFonts w:ascii="Times New Roman" w:hAnsi="Times New Roman"/>
-          <w:bCs/>
-          <w:sz w:val="26"/>
-          <w:szCs w:val="26"/>
-        </w:rPr>
-        <w:t xml:space="preserve"> </w:t>
-      </w:r>
-      <w:r>
-        <w:rPr>
-          <w:rFonts w:ascii="Times New Roman" w:hAnsi="Times New Roman"/>
-          <w:b w:val="0"/>
-          <w:bCs/>
-          <w:sz w:val="26"/>
-          <w:szCs w:val="26"/>
-        </w:rPr>
-        <w:t xml:space="preserve">ngay sau khi ký Hợp đồng vào ngày </w:t>
-      </w:r>
-      <w:r>
-        <w:rPr>
-          <w:rFonts w:ascii="Times New Roman" w:hAnsi="Times New Roman"/>
-          <w:sz w:val="26"/>
-          <w:szCs w:val="26"/>
-        </w:rPr>
-        <w:t xml:space="preserve">…. </w:t>
-      </w:r>
-      <w:r>
-        <w:rPr>
-          <w:rFonts w:ascii="Times New Roman" w:hAnsi="Times New Roman"/>
-          <w:b w:val="0"/>
-          <w:bCs/>
-          <w:sz w:val="26"/>
-          <w:szCs w:val="26"/>
-        </w:rPr>
-        <w:t>Tháng</w:t>
-      </w:r>
-      <w:proofErr w:type="gramStart"/>
-      <w:r>
-        <w:rPr>
-          <w:rFonts w:ascii="Times New Roman" w:hAnsi="Times New Roman"/>
-          <w:b w:val="0"/>
-          <w:bCs/>
-          <w:sz w:val="26"/>
-          <w:szCs w:val="26"/>
-        </w:rPr>
-        <w:t>…..</w:t>
-      </w:r>
-      <w:proofErr w:type="gramEnd"/>
-      <w:r>
-        <w:rPr>
-          <w:rFonts w:ascii="Times New Roman" w:hAnsi="Times New Roman"/>
-          <w:b w:val="0"/>
-          <w:bCs/>
-          <w:sz w:val="26"/>
-          <w:szCs w:val="26"/>
-        </w:rPr>
-        <w:t xml:space="preserve"> Năm </w:t>
-      </w:r>
-      <w:r>
-        <w:rPr>
-          <w:rFonts w:ascii="Times New Roman" w:hAnsi="Times New Roman"/>
-          <w:sz w:val="26"/>
-          <w:szCs w:val="26"/>
-        </w:rPr>
-        <w:t>….</w:t>
+          <w:b w:val="0"/>
+          <w:bCs/>
+          <w:sz w:val="26"/>
+          <w:szCs w:val="26"/>
+        </w:rPr>
+        <w:t xml:space="preserve">ngay sau khi ký Hợp đồng vào ngày {Coc_Ngay} tháng {Coc_Thang} năm {Coc_Nam}</w:t>
       </w:r>
       <w:r>
         <w:rPr>
@@ -6519,7 +6133,7 @@
           <w:szCs w:val="26"/>
           <w:lang w:val="fr-FR"/>
         </w:rPr>
-        <w:t xml:space="preserve">   Ông :</w:t>
+        <w:t xml:space="preserve">   Ông: {BenA_NguoiDaiDien}</w:t>
       </w:r>
       <w:r>
         <w:rPr>
@@ -6557,7 +6171,7 @@
           <w:lang w:val="fr-FR"/>
         </w:rPr>
         <w:tab/>
-        <w:t xml:space="preserve">                             Ông/Bà : </w:t>
+        <w:t xml:space="preserve">                             Ông/Bà: {BenB_TenDaiDien} </w:t>
       </w:r>
     </w:p>
     <w:p>
@@ -6579,7 +6193,7 @@
           <w:szCs w:val="26"/>
           <w:lang w:val="fr-FR"/>
         </w:rPr>
-        <w:t xml:space="preserve">   Chức vụ : </w:t>
+        <w:t xml:space="preserve">   Chức Vụ: {BenA_ChucVu} </w:t>
       </w:r>
       <w:r>
         <w:rPr>
@@ -6687,6 +6301,10 @@
           <w:lang w:val="fr-FR"/>
         </w:rPr>
         <w:t>DỊCH VỤ ĐƯỢC KHUYẾN MÃI VÀ CHƯƠNG TRÌNH ƯU ĐÃI ÁP DỤNG</w:t>
+        <w:br/>
+        <w:t>{DS_KhuyenMai}</w:t>
+        <w:br/>
+        <w:t>{DS_KhuyenMai}</w:t>
       </w:r>
     </w:p>
     <w:p>
@@ -7532,6 +7150,10 @@
         </w:rPr>
         <w:lastRenderedPageBreak/>
         <w:t>CÁC ĐIỀU KHOẢN BỔ SUNG KHÁC (NẾU CÓ)</w:t>
+        <w:br/>
+        <w:t>{DieuKhoanBoSung}</w:t>
+        <w:br/>
+        <w:t>{DieuKhoanBoSung}</w:t>
       </w:r>
       <w:r>
         <w:rPr>
@@ -8139,18 +7761,7 @@
           <w:szCs w:val="26"/>
           <w:lang w:val="fr-FR"/>
         </w:rPr>
-        <w:t xml:space="preserve">Chức </w:t>
-      </w:r>
-      <w:proofErr w:type="gramStart"/>
-      <w:r>
-        <w:rPr>
-          <w:rFonts w:ascii="Times New Roman" w:hAnsi="Times New Roman"/>
-          <w:b/>
-          <w:sz w:val="26"/>
-          <w:szCs w:val="26"/>
-          <w:lang w:val="fr-FR"/>
-        </w:rPr>
-        <w:t>vụ:</w:t>
+        <w:t xml:space="preserve">Chức vụ: {BenB_ChucVu}</w:t>
       </w:r>
       <w:proofErr w:type="gramEnd"/>
       <w:r>

</xml_diff>

<commit_message>
feat: add sample contract document template to backend samples directory
</commit_message>
<xml_diff>
--- a/backend-app/samples/hop_dong.docx
+++ b/backend-app/samples/hop_dong.docx
@@ -1196,7 +1196,7 @@
           <w:szCs w:val="26"/>
         </w:rPr>
         <w:tab/>
-        <w:t xml:space="preserve">Số bàn tiệc chính thức: {Tiec_SoBanChinhThuc} {Tiec_SoBanChinhThuc} </w:t>
+        <w:t xml:space="preserve">Số bàn tiệc chính thức: {Tiec_SoBanChinhThuc} </w:t>
       </w:r>
     </w:p>
     <w:p>
@@ -1217,7 +1217,7 @@
           <w:szCs w:val="26"/>
         </w:rPr>
         <w:tab/>
-        <w:t xml:space="preserve">Số lượng bàn tặng: {Tiec_SoBanTang}      {Tiec_SoBanTang} </w:t>
+        <w:t xml:space="preserve">Số lượng bàn tặng: {Tiec_SoBanTang} </w:t>
       </w:r>
     </w:p>
     <w:p>
@@ -1238,7 +1238,7 @@
           <w:szCs w:val="26"/>
         </w:rPr>
         <w:tab/>
-        <w:t>Số lượng bàn dự phòng: {Tiec_SoBanDuPhong}  {Tiec_SoBanDuPhong}</w:t>
+        <w:t>Số lượng bàn dự phòng: {Tiec_SoBanDuPhong}</w:t>
       </w:r>
       <w:r>
         <w:rPr>
@@ -1269,7 +1269,7 @@
           <w:szCs w:val="26"/>
         </w:rPr>
         <w:tab/>
-        <w:t xml:space="preserve">Số khách trong một bàn: {Tiec_SoKhach1Ban} {Tiec_SoKhach1Ban} </w:t>
+        <w:t xml:space="preserve">Số khách trong một bàn: {Tiec_SoKhach1Ban} </w:t>
       </w:r>
     </w:p>
     <w:p>
@@ -6301,8 +6301,6 @@
           <w:lang w:val="fr-FR"/>
         </w:rPr>
         <w:t>DỊCH VỤ ĐƯỢC KHUYẾN MÃI VÀ CHƯƠNG TRÌNH ƯU ĐÃI ÁP DỤNG</w:t>
-        <w:br/>
-        <w:t>{DS_KhuyenMai}</w:t>
         <w:br/>
         <w:t>{DS_KhuyenMai}</w:t>
       </w:r>
@@ -7150,8 +7148,6 @@
         </w:rPr>
         <w:lastRenderedPageBreak/>
         <w:t>CÁC ĐIỀU KHOẢN BỔ SUNG KHÁC (NẾU CÓ)</w:t>
-        <w:br/>
-        <w:t>{DieuKhoanBoSung}</w:t>
         <w:br/>
         <w:t>{DieuKhoanBoSung}</w:t>
       </w:r>

</xml_diff>

<commit_message>
feat: add customer API and migrate contract JSON menu data to normalized detail tables
</commit_message>
<xml_diff>
--- a/backend-app/samples/hop_dong.docx
+++ b/backend-app/samples/hop_dong.docx
@@ -987,8 +987,19 @@
           <w:sz w:val="26"/>
           <w:szCs w:val="26"/>
         </w:rPr>
-        <w:t xml:space="preserve"> CƯỚI – LỄ TÂN HÔN/VU QUY/BÁO HỶ</w:t>
-      </w:r>
+        <w:t xml:space="preserve"> </w:t>
+      </w:r>
+      <w:bookmarkStart w:id="0" w:name="_GoBack"/>
+      <w:r>
+        <w:rPr>
+          <w:rFonts w:hint="default" w:ascii="Times New Roman" w:hAnsi="Times New Roman"/>
+          <w:b/>
+          <w:sz w:val="26"/>
+          <w:szCs w:val="26"/>
+        </w:rPr>
+        <w:t>{LoaiHinhSuKien}</w:t>
+      </w:r>
+      <w:bookmarkEnd w:id="0"/>
     </w:p>
     <w:p>
       <w:pPr>
@@ -5320,19 +5331,7 @@
           <w:szCs w:val="26"/>
           <w:lang w:val="fr-FR"/>
         </w:rPr>
-        <w:t xml:space="preserve">   Chức Vụ: {BenA</w:t>
-      </w:r>
-      <w:bookmarkStart w:id="0" w:name="_GoBack"/>
-      <w:bookmarkEnd w:id="0"/>
-      <w:r>
-        <w:rPr>
-          <w:rFonts w:ascii="Times New Roman" w:hAnsi="Times New Roman"/>
-          <w:b/>
-          <w:sz w:val="26"/>
-          <w:szCs w:val="26"/>
-          <w:lang w:val="fr-FR"/>
-        </w:rPr>
-        <w:t xml:space="preserve">ChucVu} </w:t>
+        <w:t xml:space="preserve">   Chức Vụ: {BenAChucVu} </w:t>
       </w:r>
       <w:r>
         <w:rPr>
@@ -8348,7 +8347,7 @@
   <w:docDefaults>
     <w:rPrDefault>
       <w:rPr>
-        <w:rFonts w:asciiTheme="minorHAnsi" w:hAnsiTheme="minorHAnsi" w:eastAsiaTheme="minorHAnsi" w:cstheme="minorBidi"/>
+        <w:rFonts w:ascii="Times New Roman" w:hAnsi="Times New Roman" w:eastAsia="SimSun" w:cs="Times New Roman"/>
       </w:rPr>
     </w:rPrDefault>
     <w:pPrDefault/>
@@ -8419,7 +8418,7 @@
     <w:lsdException w:qFormat="1" w:unhideWhenUsed="0" w:uiPriority="10" w:semiHidden="0" w:name="Title"/>
     <w:lsdException w:uiPriority="99" w:name="Closing"/>
     <w:lsdException w:uiPriority="99" w:name="Signature"/>
-    <w:lsdException w:uiPriority="1" w:name="Default Paragraph Font"/>
+    <w:lsdException w:qFormat="1" w:uiPriority="1" w:name="Default Paragraph Font"/>
     <w:lsdException w:qFormat="1" w:uiPriority="99" w:name="Body Text"/>
     <w:lsdException w:uiPriority="99" w:name="Body Text Indent"/>
     <w:lsdException w:uiPriority="99" w:name="List Continue"/>
@@ -8622,6 +8621,7 @@
     <w:name w:val="Default Paragraph Font"/>
     <w:semiHidden/>
     <w:unhideWhenUsed/>
+    <w:qFormat/>
     <w:uiPriority w:val="1"/>
   </w:style>
   <w:style w:type="table" w:default="1" w:styleId="3">

</xml_diff>

<commit_message>
feat: add sample contract document template
</commit_message>
<xml_diff>
--- a/backend-app/samples/hop_dong.docx
+++ b/backend-app/samples/hop_dong.docx
@@ -6267,100 +6267,6 @@
         </w:rPr>
         <w:tab/>
       </w:r>
-    </w:p>
-    <w:p>
-      <w:pPr>
-        <w:pStyle w:val="20"/>
-        <w:numPr>
-          <w:ilvl w:val="0"/>
-          <w:numId w:val="2"/>
-        </w:numPr>
-        <w:tabs>
-          <w:tab w:val="left" w:pos="0"/>
-        </w:tabs>
-        <w:spacing w:before="120" w:after="120" w:line="360" w:lineRule="auto"/>
-        <w:ind w:left="-220" w:leftChars="-100" w:firstLine="0"/>
-        <w:rPr>
-          <w:rFonts w:ascii="Times New Roman" w:hAnsi="Times New Roman"/>
-          <w:sz w:val="26"/>
-          <w:szCs w:val="26"/>
-        </w:rPr>
-      </w:pPr>
-      <w:r>
-        <w:rPr>
-          <w:rFonts w:ascii="Times New Roman" w:hAnsi="Times New Roman"/>
-          <w:sz w:val="26"/>
-          <w:szCs w:val="26"/>
-        </w:rPr>
-        <w:t>Áp dụng thực đơn tự chọn theo bảng giá lẻ (chưa bao gồm phí phục vụ).</w:t>
-      </w:r>
-    </w:p>
-    <w:p>
-      <w:pPr>
-        <w:pStyle w:val="20"/>
-        <w:numPr>
-          <w:ilvl w:val="0"/>
-          <w:numId w:val="2"/>
-        </w:numPr>
-        <w:tabs>
-          <w:tab w:val="left" w:pos="0"/>
-        </w:tabs>
-        <w:spacing w:before="120" w:after="120" w:line="360" w:lineRule="auto"/>
-        <w:ind w:left="-220" w:leftChars="-100" w:firstLine="0"/>
-        <w:rPr>
-          <w:rFonts w:ascii="Times New Roman" w:hAnsi="Times New Roman"/>
-          <w:sz w:val="26"/>
-          <w:szCs w:val="26"/>
-        </w:rPr>
-      </w:pPr>
-      <w:r>
-        <w:rPr>
-          <w:rFonts w:ascii="Times New Roman" w:hAnsi="Times New Roman"/>
-          <w:sz w:val="26"/>
-          <w:szCs w:val="26"/>
-        </w:rPr>
-        <w:t>Áp dụng chương trình đặt 10 bàn tặng 01 bàn (từ 20 bàn trở lên)</w:t>
-      </w:r>
-    </w:p>
-    <w:p>
-      <w:pPr>
-        <w:pStyle w:val="18"/>
-        <w:spacing w:before="120" w:after="120"/>
-        <w:ind w:left="-220" w:leftChars="-100"/>
-        <w:outlineLvl w:val="0"/>
-        <w:rPr>
-          <w:rFonts w:ascii="Times New Roman" w:hAnsi="Times New Roman"/>
-          <w:bCs/>
-          <w:i/>
-          <w:sz w:val="26"/>
-          <w:szCs w:val="26"/>
-        </w:rPr>
-      </w:pPr>
-      <w:r>
-        <w:rPr>
-          <w:rFonts w:ascii="Times New Roman" w:hAnsi="Times New Roman"/>
-          <w:bCs/>
-          <w:i/>
-          <w:sz w:val="26"/>
-          <w:szCs w:val="26"/>
-        </w:rPr>
-        <w:t>Tất cả các chương trình khuyến mãi và ưu đãi trên không quy đổi thành tiền mặt và không thay thế bằng dịch vụ khác nếu quý khách không sử dụng.</w:t>
-      </w:r>
-    </w:p>
-    <w:p>
-      <w:pPr>
-        <w:pStyle w:val="18"/>
-        <w:spacing w:before="120" w:after="120"/>
-        <w:ind w:left="-220" w:leftChars="-100"/>
-        <w:outlineLvl w:val="0"/>
-        <w:rPr>
-          <w:rFonts w:ascii="Times New Roman" w:hAnsi="Times New Roman"/>
-          <w:bCs/>
-          <w:i/>
-          <w:sz w:val="26"/>
-          <w:szCs w:val="26"/>
-        </w:rPr>
-      </w:pPr>
     </w:p>
     <w:p>
       <w:pPr>

</xml_diff>

<commit_message>
feat: add sample contract document for wedding banquet system
</commit_message>
<xml_diff>
--- a/backend-app/samples/hop_dong.docx
+++ b/backend-app/samples/hop_dong.docx
@@ -989,7 +989,6 @@
         </w:rPr>
         <w:t xml:space="preserve"> </w:t>
       </w:r>
-      <w:bookmarkStart w:id="0" w:name="_GoBack"/>
       <w:r>
         <w:rPr>
           <w:rFonts w:hint="default" w:ascii="Times New Roman" w:hAnsi="Times New Roman"/>
@@ -999,7 +998,6 @@
         </w:rPr>
         <w:t>{LoaiHinhSuKien}</w:t>
       </w:r>
-      <w:bookmarkEnd w:id="0"/>
     </w:p>
     <w:p>
       <w:pPr>
@@ -4927,10 +4925,13 @@
     </w:p>
     <w:p>
       <w:pPr>
-        <w:spacing w:before="120" w:after="120" w:line="360" w:lineRule="auto"/>
-        <w:ind w:left="-220" w:leftChars="-100"/>
-        <w:rPr>
-          <w:rFonts w:ascii="Times New Roman" w:hAnsi="Times New Roman"/>
+        <w:pStyle w:val="18"/>
+        <w:spacing w:before="120" w:after="120" w:line="360" w:lineRule="auto"/>
+        <w:ind w:left="-220" w:leftChars="-100"/>
+        <w:jc w:val="both"/>
+        <w:rPr>
+          <w:rFonts w:ascii="Times New Roman" w:hAnsi="Times New Roman"/>
+          <w:b/>
           <w:sz w:val="26"/>
           <w:szCs w:val="26"/>
           <w:lang w:val="fr-FR"/>
@@ -4939,17 +4940,14 @@
       <w:r>
         <w:rPr>
           <w:rFonts w:ascii="Times New Roman" w:hAnsi="Times New Roman"/>
+          <w:b/>
           <w:sz w:val="26"/>
           <w:szCs w:val="26"/>
           <w:lang w:val="fr-FR"/>
         </w:rPr>
-        <w:t xml:space="preserve">                  </w:t>
-      </w:r>
-    </w:p>
-    <w:p>
-      <w:pPr>
-        <w:spacing w:before="120" w:after="120" w:line="360" w:lineRule="auto"/>
-        <w:ind w:left="-220" w:leftChars="-100"/>
+        <w:t>DỊCH VỤ ĐƯỢC KHUYẾN MÃI VÀ CHƯƠNG TRÌNH ƯU ĐÃI ÁP DỤNG</w:t>
+      </w:r>
+      <w:r>
         <w:rPr>
           <w:rFonts w:ascii="Times New Roman" w:hAnsi="Times New Roman"/>
           <w:b/>
@@ -4957,545 +4955,37 @@
           <w:szCs w:val="26"/>
           <w:lang w:val="fr-FR"/>
         </w:rPr>
-      </w:pPr>
-      <w:r>
-        <w:rPr>
-          <w:rFonts w:ascii="Times New Roman" w:hAnsi="Times New Roman"/>
-          <w:b/>
-          <w:sz w:val="26"/>
-          <w:szCs w:val="26"/>
-          <w:lang w:val="fr-FR"/>
-        </w:rPr>
-        <w:t xml:space="preserve">               ĐẠI DIỆN BÊN A</w:t>
-      </w:r>
-      <w:r>
-        <w:rPr>
-          <w:rFonts w:ascii="Times New Roman" w:hAnsi="Times New Roman"/>
-          <w:b/>
-          <w:sz w:val="26"/>
-          <w:szCs w:val="26"/>
-          <w:lang w:val="fr-FR"/>
-        </w:rPr>
-        <w:tab/>
-      </w:r>
-      <w:r>
-        <w:rPr>
-          <w:rFonts w:ascii="Times New Roman" w:hAnsi="Times New Roman"/>
-          <w:b/>
-          <w:sz w:val="26"/>
-          <w:szCs w:val="26"/>
-          <w:lang w:val="fr-FR"/>
-        </w:rPr>
-        <w:tab/>
-      </w:r>
-      <w:r>
-        <w:rPr>
-          <w:rFonts w:ascii="Times New Roman" w:hAnsi="Times New Roman"/>
-          <w:b/>
-          <w:sz w:val="26"/>
-          <w:szCs w:val="26"/>
-          <w:lang w:val="fr-FR"/>
-        </w:rPr>
-        <w:tab/>
-      </w:r>
-      <w:r>
-        <w:rPr>
-          <w:rFonts w:ascii="Times New Roman" w:hAnsi="Times New Roman"/>
-          <w:b/>
-          <w:sz w:val="26"/>
-          <w:szCs w:val="26"/>
-          <w:lang w:val="fr-FR"/>
-        </w:rPr>
-        <w:tab/>
-      </w:r>
-      <w:r>
-        <w:rPr>
-          <w:rFonts w:ascii="Times New Roman" w:hAnsi="Times New Roman"/>
-          <w:b/>
-          <w:sz w:val="26"/>
-          <w:szCs w:val="26"/>
-          <w:lang w:val="fr-FR"/>
-        </w:rPr>
-        <w:t xml:space="preserve">                    ĐẠI DIỆN BÊN B</w:t>
-      </w:r>
-      <w:r>
-        <w:rPr>
-          <w:rFonts w:ascii="Times New Roman" w:hAnsi="Times New Roman"/>
-          <w:b/>
-          <w:sz w:val="26"/>
-          <w:szCs w:val="26"/>
-          <w:lang w:val="fr-FR"/>
-        </w:rPr>
-        <w:tab/>
-      </w:r>
-    </w:p>
-    <w:p>
-      <w:pPr>
-        <w:spacing w:before="120" w:after="120" w:line="360" w:lineRule="auto"/>
-        <w:rPr>
-          <w:rFonts w:ascii="Times New Roman" w:hAnsi="Times New Roman"/>
-          <w:b/>
-          <w:sz w:val="26"/>
-          <w:szCs w:val="26"/>
-          <w:u w:val="single"/>
-          <w:lang w:val="fr-FR"/>
-        </w:rPr>
-      </w:pPr>
-    </w:p>
-    <w:p>
-      <w:pPr>
-        <w:spacing w:before="120" w:after="120" w:line="360" w:lineRule="auto"/>
-        <w:rPr>
-          <w:rFonts w:ascii="Times New Roman" w:hAnsi="Times New Roman"/>
-          <w:b/>
-          <w:sz w:val="26"/>
-          <w:szCs w:val="26"/>
-          <w:u w:val="single"/>
-          <w:lang w:val="fr-FR"/>
-        </w:rPr>
-      </w:pPr>
-    </w:p>
-    <w:p>
-      <w:pPr>
-        <w:spacing w:before="120" w:after="120" w:line="360" w:lineRule="auto"/>
-        <w:ind w:left="-220" w:leftChars="-100"/>
-        <w:rPr>
-          <w:rFonts w:ascii="Times New Roman" w:hAnsi="Times New Roman"/>
-          <w:b/>
-          <w:sz w:val="26"/>
-          <w:szCs w:val="26"/>
-          <w:lang w:val="fr-FR"/>
-        </w:rPr>
-      </w:pPr>
-      <w:r>
-        <w:rPr>
-          <w:rFonts w:ascii="Times New Roman" w:hAnsi="Times New Roman"/>
-          <w:b/>
-          <w:sz w:val="26"/>
-          <w:szCs w:val="26"/>
-          <w:lang w:val="fr-FR"/>
-        </w:rPr>
-        <w:t xml:space="preserve">                   </w:t>
-      </w:r>
-    </w:p>
-    <w:p>
-      <w:pPr>
-        <w:spacing w:before="120" w:after="120" w:line="360" w:lineRule="auto"/>
-        <w:ind w:left="-220" w:leftChars="-100"/>
-        <w:rPr>
-          <w:rFonts w:ascii="Times New Roman" w:hAnsi="Times New Roman"/>
-          <w:b/>
-          <w:sz w:val="26"/>
-          <w:szCs w:val="26"/>
-          <w:u w:val="single"/>
-          <w:lang w:val="fr-FR"/>
-        </w:rPr>
-      </w:pPr>
-      <w:r>
-        <w:rPr>
-          <w:rFonts w:ascii="Times New Roman" w:hAnsi="Times New Roman"/>
-          <w:b/>
-          <w:sz w:val="26"/>
-          <w:szCs w:val="26"/>
-          <w:lang w:val="fr-FR"/>
-        </w:rPr>
-        <w:t xml:space="preserve">   Ký: </w:t>
-      </w:r>
-      <w:r>
-        <w:rPr>
-          <w:rFonts w:ascii="Times New Roman" w:hAnsi="Times New Roman"/>
-          <w:b/>
-          <w:sz w:val="26"/>
-          <w:szCs w:val="26"/>
-          <w:u w:val="single"/>
-          <w:lang w:val="fr-FR"/>
-        </w:rPr>
-        <w:tab/>
-      </w:r>
-      <w:r>
-        <w:rPr>
-          <w:rFonts w:ascii="Times New Roman" w:hAnsi="Times New Roman"/>
-          <w:b/>
-          <w:sz w:val="26"/>
-          <w:szCs w:val="26"/>
-          <w:u w:val="single"/>
-          <w:lang w:val="fr-FR"/>
-        </w:rPr>
-        <w:tab/>
-      </w:r>
-      <w:r>
-        <w:rPr>
-          <w:rFonts w:ascii="Times New Roman" w:hAnsi="Times New Roman"/>
-          <w:b/>
-          <w:sz w:val="26"/>
-          <w:szCs w:val="26"/>
-          <w:u w:val="single"/>
-          <w:lang w:val="fr-FR"/>
-        </w:rPr>
-        <w:tab/>
-      </w:r>
-      <w:r>
-        <w:rPr>
-          <w:rFonts w:ascii="Times New Roman" w:hAnsi="Times New Roman"/>
-          <w:b/>
-          <w:sz w:val="26"/>
-          <w:szCs w:val="26"/>
-          <w:u w:val="single"/>
-          <w:lang w:val="fr-FR"/>
-        </w:rPr>
-        <w:tab/>
-      </w:r>
-      <w:r>
-        <w:rPr>
-          <w:rFonts w:ascii="Times New Roman" w:hAnsi="Times New Roman"/>
-          <w:b/>
-          <w:sz w:val="26"/>
-          <w:szCs w:val="26"/>
-          <w:u w:val="single"/>
-          <w:lang w:val="fr-FR"/>
-        </w:rPr>
-        <w:tab/>
-      </w:r>
-      <w:r>
-        <w:rPr>
-          <w:rFonts w:ascii="Times New Roman" w:hAnsi="Times New Roman"/>
-          <w:b/>
-          <w:sz w:val="26"/>
-          <w:szCs w:val="26"/>
-          <w:lang w:val="fr-FR"/>
-        </w:rPr>
-        <w:tab/>
-      </w:r>
-      <w:r>
-        <w:rPr>
-          <w:rFonts w:ascii="Times New Roman" w:hAnsi="Times New Roman"/>
-          <w:b/>
-          <w:sz w:val="26"/>
-          <w:szCs w:val="26"/>
-          <w:lang w:val="fr-FR"/>
-        </w:rPr>
-        <w:tab/>
-      </w:r>
-      <w:r>
-        <w:rPr>
-          <w:rFonts w:ascii="Times New Roman" w:hAnsi="Times New Roman"/>
-          <w:b/>
-          <w:sz w:val="26"/>
-          <w:szCs w:val="26"/>
-          <w:lang w:val="fr-FR"/>
-        </w:rPr>
-        <w:t xml:space="preserve">     Ký: </w:t>
-      </w:r>
-      <w:r>
-        <w:rPr>
-          <w:rFonts w:ascii="Times New Roman" w:hAnsi="Times New Roman"/>
-          <w:b/>
-          <w:sz w:val="26"/>
-          <w:szCs w:val="26"/>
-          <w:u w:val="single"/>
-          <w:lang w:val="fr-FR"/>
-        </w:rPr>
-        <w:tab/>
-      </w:r>
-      <w:r>
-        <w:rPr>
-          <w:rFonts w:ascii="Times New Roman" w:hAnsi="Times New Roman"/>
-          <w:b/>
-          <w:sz w:val="26"/>
-          <w:szCs w:val="26"/>
-          <w:u w:val="single"/>
-          <w:lang w:val="fr-FR"/>
-        </w:rPr>
-        <w:tab/>
-      </w:r>
-      <w:r>
-        <w:rPr>
-          <w:rFonts w:ascii="Times New Roman" w:hAnsi="Times New Roman"/>
-          <w:b/>
-          <w:sz w:val="26"/>
-          <w:szCs w:val="26"/>
-          <w:u w:val="single"/>
-          <w:lang w:val="fr-FR"/>
-        </w:rPr>
-        <w:tab/>
-      </w:r>
-      <w:r>
-        <w:rPr>
-          <w:rFonts w:ascii="Times New Roman" w:hAnsi="Times New Roman"/>
-          <w:b/>
-          <w:sz w:val="26"/>
-          <w:szCs w:val="26"/>
-          <w:u w:val="single"/>
-          <w:lang w:val="fr-FR"/>
-        </w:rPr>
-        <w:tab/>
-      </w:r>
-      <w:r>
-        <w:rPr>
-          <w:rFonts w:ascii="Times New Roman" w:hAnsi="Times New Roman"/>
-          <w:b/>
-          <w:sz w:val="26"/>
-          <w:szCs w:val="26"/>
-          <w:u w:val="single"/>
-          <w:lang w:val="fr-FR"/>
-        </w:rPr>
-        <w:tab/>
-      </w:r>
-    </w:p>
-    <w:p>
-      <w:pPr>
-        <w:spacing w:before="120" w:after="120" w:line="360" w:lineRule="auto"/>
-        <w:ind w:left="-220" w:leftChars="-100"/>
-        <w:rPr>
-          <w:rFonts w:ascii="Times New Roman" w:hAnsi="Times New Roman"/>
-          <w:b/>
-          <w:sz w:val="26"/>
-          <w:szCs w:val="26"/>
-          <w:lang w:val="fr-FR"/>
-        </w:rPr>
-      </w:pPr>
-      <w:r>
-        <w:rPr>
-          <w:rFonts w:ascii="Times New Roman" w:hAnsi="Times New Roman"/>
-          <w:b/>
-          <w:sz w:val="26"/>
-          <w:szCs w:val="26"/>
-          <w:lang w:val="fr-FR"/>
-        </w:rPr>
-        <w:t xml:space="preserve">   Ông: {BenANguoiDaiDien}</w:t>
-      </w:r>
-      <w:r>
-        <w:rPr>
-          <w:rFonts w:ascii="Times New Roman" w:hAnsi="Times New Roman"/>
-          <w:b/>
-          <w:sz w:val="26"/>
-          <w:szCs w:val="26"/>
-        </w:rPr>
-        <w:tab/>
-      </w:r>
-      <w:r>
-        <w:rPr>
-          <w:rFonts w:ascii="Times New Roman" w:hAnsi="Times New Roman"/>
-          <w:b/>
-          <w:sz w:val="26"/>
-          <w:szCs w:val="26"/>
-        </w:rPr>
-        <w:tab/>
-      </w:r>
-      <w:r>
-        <w:rPr>
-          <w:rFonts w:ascii="Times New Roman" w:hAnsi="Times New Roman"/>
-          <w:b/>
-          <w:sz w:val="26"/>
-          <w:szCs w:val="26"/>
-        </w:rPr>
-        <w:tab/>
-      </w:r>
-      <w:r>
-        <w:rPr>
-          <w:rFonts w:ascii="Times New Roman" w:hAnsi="Times New Roman"/>
-          <w:b/>
-          <w:sz w:val="26"/>
-          <w:szCs w:val="26"/>
-          <w:lang w:val="fr-FR"/>
-        </w:rPr>
-        <w:tab/>
-      </w:r>
-      <w:r>
-        <w:rPr>
-          <w:rFonts w:ascii="Times New Roman" w:hAnsi="Times New Roman"/>
-          <w:b/>
-          <w:sz w:val="26"/>
-          <w:szCs w:val="26"/>
-          <w:lang w:val="fr-FR"/>
-        </w:rPr>
-        <w:t xml:space="preserve">                             Ông/Bà: {BenBTenDaiDien} </w:t>
-      </w:r>
-    </w:p>
-    <w:p>
-      <w:pPr>
-        <w:spacing w:before="120" w:after="120" w:line="360" w:lineRule="auto"/>
-        <w:ind w:left="-220" w:leftChars="-100"/>
-        <w:rPr>
-          <w:rFonts w:ascii="Times New Roman" w:hAnsi="Times New Roman"/>
-          <w:sz w:val="26"/>
-          <w:szCs w:val="26"/>
-          <w:lang w:val="fr-FR"/>
-        </w:rPr>
-      </w:pPr>
-      <w:r>
-        <w:rPr>
-          <w:rFonts w:ascii="Times New Roman" w:hAnsi="Times New Roman"/>
-          <w:b/>
-          <w:sz w:val="26"/>
-          <w:szCs w:val="26"/>
-          <w:lang w:val="fr-FR"/>
-        </w:rPr>
-        <w:t xml:space="preserve">   Chức Vụ: {BenAChucVu} </w:t>
-      </w:r>
-      <w:r>
-        <w:rPr>
-          <w:rFonts w:ascii="Times New Roman" w:hAnsi="Times New Roman"/>
-          <w:b/>
-          <w:sz w:val="26"/>
-          <w:szCs w:val="26"/>
-          <w:lang w:val="fr-FR"/>
-        </w:rPr>
-        <w:tab/>
-      </w:r>
-      <w:r>
-        <w:rPr>
-          <w:rFonts w:ascii="Times New Roman" w:hAnsi="Times New Roman"/>
-          <w:b/>
-          <w:sz w:val="26"/>
-          <w:szCs w:val="26"/>
-          <w:lang w:val="fr-FR"/>
-        </w:rPr>
-        <w:tab/>
-      </w:r>
-      <w:r>
-        <w:rPr>
-          <w:rFonts w:ascii="Times New Roman" w:hAnsi="Times New Roman"/>
-          <w:b/>
-          <w:sz w:val="26"/>
-          <w:szCs w:val="26"/>
-          <w:lang w:val="fr-FR"/>
-        </w:rPr>
-        <w:tab/>
-      </w:r>
-      <w:r>
-        <w:rPr>
-          <w:rFonts w:ascii="Times New Roman" w:hAnsi="Times New Roman"/>
-          <w:b/>
-          <w:sz w:val="26"/>
-          <w:szCs w:val="26"/>
-          <w:lang w:val="fr-FR"/>
-        </w:rPr>
-        <w:t xml:space="preserve">     </w:t>
-      </w:r>
-      <w:r>
-        <w:rPr>
-          <w:rFonts w:ascii="Times New Roman" w:hAnsi="Times New Roman"/>
-          <w:b/>
-          <w:sz w:val="26"/>
-          <w:szCs w:val="26"/>
-          <w:lang w:val="fr-FR"/>
-        </w:rPr>
-        <w:tab/>
-      </w:r>
-      <w:r>
-        <w:rPr>
-          <w:rFonts w:ascii="Times New Roman" w:hAnsi="Times New Roman"/>
-          <w:b/>
-          <w:sz w:val="26"/>
-          <w:szCs w:val="26"/>
-          <w:lang w:val="fr-FR"/>
-        </w:rPr>
-        <w:tab/>
-      </w:r>
-      <w:r>
-        <w:rPr>
-          <w:rFonts w:ascii="Times New Roman" w:hAnsi="Times New Roman"/>
-          <w:b/>
-          <w:sz w:val="26"/>
-          <w:szCs w:val="26"/>
-          <w:lang w:val="fr-FR"/>
-        </w:rPr>
-        <w:tab/>
-      </w:r>
-      <w:r>
-        <w:rPr>
-          <w:rFonts w:ascii="Times New Roman" w:hAnsi="Times New Roman"/>
-          <w:b/>
-          <w:sz w:val="26"/>
-          <w:szCs w:val="26"/>
-          <w:lang w:val="fr-FR"/>
-        </w:rPr>
-        <w:t xml:space="preserve">     </w:t>
-      </w:r>
-    </w:p>
-    <w:p>
-      <w:pPr>
-        <w:spacing w:before="120" w:after="120" w:line="360" w:lineRule="auto"/>
+        <w:br w:type="textWrapping"/>
+      </w:r>
+    </w:p>
+    <w:p>
+      <w:pPr>
+        <w:spacing w:line="276" w:lineRule="auto"/>
         <w:ind w:left="-220" w:leftChars="-100"/>
         <w:jc w:val="center"/>
         <w:rPr>
           <w:rFonts w:ascii="Times New Roman" w:hAnsi="Times New Roman"/>
-          <w:b/>
-          <w:sz w:val="26"/>
-          <w:szCs w:val="26"/>
-          <w:lang w:val="fr-FR"/>
-        </w:rPr>
-      </w:pPr>
-      <w:r>
-        <w:rPr>
-          <w:rFonts w:ascii="Times New Roman" w:hAnsi="Times New Roman"/>
-          <w:b/>
-          <w:sz w:val="26"/>
-          <w:szCs w:val="26"/>
-          <w:u w:val="single"/>
-          <w:lang w:val="fr-FR"/>
-        </w:rPr>
-        <w:br w:type="page"/>
-      </w:r>
-      <w:r>
-        <w:rPr>
-          <w:rFonts w:ascii="Times New Roman" w:hAnsi="Times New Roman"/>
-          <w:b/>
-          <w:sz w:val="26"/>
-          <w:szCs w:val="26"/>
-        </w:rPr>
-        <w:t xml:space="preserve"> </w:t>
-      </w:r>
-      <w:r>
-        <w:rPr>
-          <w:rFonts w:ascii="Times New Roman" w:hAnsi="Times New Roman"/>
-          <w:b/>
-          <w:sz w:val="26"/>
-          <w:szCs w:val="26"/>
-          <w:lang w:val="fr-FR"/>
-        </w:rPr>
-        <w:t>DỊCH VỤ ĐƯỢC KHUYẾN MÃI VÀ CHƯƠNG TRÌNH ƯU ĐÃI ÁP DỤNG</w:t>
-      </w:r>
-      <w:r>
-        <w:rPr>
-          <w:rFonts w:ascii="Times New Roman" w:hAnsi="Times New Roman"/>
-          <w:b/>
-          <w:sz w:val="26"/>
-          <w:szCs w:val="26"/>
-          <w:lang w:val="fr-FR"/>
-        </w:rPr>
-        <w:br w:type="textWrapping"/>
-      </w:r>
-      <w:r>
-        <w:rPr>
-          <w:rFonts w:ascii="Times New Roman" w:hAnsi="Times New Roman"/>
-          <w:b/>
-          <w:sz w:val="26"/>
-          <w:szCs w:val="26"/>
-          <w:lang w:val="fr-FR"/>
-        </w:rPr>
-        <w:t>{DS_KhuyenMai}</w:t>
-      </w:r>
-    </w:p>
-    <w:p>
-      <w:pPr>
-        <w:spacing w:line="276" w:lineRule="auto"/>
-        <w:ind w:left="-220" w:leftChars="-100"/>
-        <w:jc w:val="center"/>
-        <w:rPr>
-          <w:rFonts w:ascii="Times New Roman" w:hAnsi="Times New Roman"/>
-          <w:sz w:val="26"/>
-          <w:szCs w:val="26"/>
-        </w:rPr>
-      </w:pPr>
-      <w:r>
-        <w:rPr>
-          <w:rFonts w:ascii="Times New Roman" w:hAnsi="Times New Roman"/>
-          <w:sz w:val="26"/>
-          <w:szCs w:val="26"/>
-        </w:rPr>
-        <w:t>(HĐ Số: …/…-HHKH20…)</w:t>
+          <w:sz w:val="26"/>
+          <w:szCs w:val="26"/>
+        </w:rPr>
+      </w:pPr>
+      <w:r>
+        <w:rPr>
+          <w:rFonts w:ascii="Times New Roman" w:hAnsi="Times New Roman"/>
+          <w:sz w:val="26"/>
+          <w:szCs w:val="26"/>
+        </w:rPr>
+        <w:t>(HĐ Số: {Sohopdong}</w:t>
+      </w:r>
+      <w:bookmarkStart w:id="0" w:name="_GoBack"/>
+      <w:bookmarkEnd w:id="0"/>
+      <w:r>
+        <w:rPr>
+          <w:rFonts w:ascii="Times New Roman" w:hAnsi="Times New Roman"/>
+          <w:sz w:val="26"/>
+          <w:szCs w:val="26"/>
+        </w:rPr>
+        <w:t>)</w:t>
       </w:r>
     </w:p>
     <w:p>
@@ -5577,597 +5067,7 @@
           </w:tcPr>
           <w:p>
             <w:pPr>
-              <w:spacing w:before="60" w:after="60"/>
-              <w:ind w:left="-220" w:leftChars="-100" w:firstLine="130" w:firstLineChars="50"/>
-              <w:rPr>
-                <w:rFonts w:ascii="Times New Roman" w:hAnsi="Times New Roman"/>
-                <w:b/>
-                <w:sz w:val="26"/>
-                <w:szCs w:val="26"/>
-                <w:lang w:val="fr-FR"/>
-              </w:rPr>
-            </w:pPr>
-            <w:r>
-              <w:rPr>
-                <w:rFonts w:ascii="Times New Roman" w:hAnsi="Times New Roman"/>
-                <w:b/>
-                <w:sz w:val="26"/>
-                <w:szCs w:val="26"/>
-                <w:lang w:val="fr-FR"/>
-              </w:rPr>
-              <w:t>Các dịch vụ khuyến mãi được áp dụng :</w:t>
-            </w:r>
-          </w:p>
-          <w:p>
-            <w:pPr>
-              <w:pStyle w:val="20"/>
-              <w:numPr>
-                <w:ilvl w:val="0"/>
-                <w:numId w:val="9"/>
-              </w:numPr>
-              <w:spacing w:after="0" w:line="360" w:lineRule="auto"/>
-              <w:ind w:left="-220" w:leftChars="-100" w:firstLine="0"/>
-              <w:jc w:val="both"/>
-              <w:rPr>
-                <w:rFonts w:ascii="Times New Roman" w:hAnsi="Times New Roman"/>
-                <w:spacing w:val="-1"/>
-                <w:sz w:val="26"/>
-                <w:szCs w:val="26"/>
-              </w:rPr>
-            </w:pPr>
-            <w:r>
-              <w:rPr>
-                <w:rFonts w:ascii="Times New Roman" w:hAnsi="Times New Roman"/>
-                <w:spacing w:val="-1"/>
-                <w:sz w:val="26"/>
-                <w:szCs w:val="26"/>
-              </w:rPr>
-              <w:t xml:space="preserve">Sân khấu tiêu chuẩn (7.2m x 3.6m x 0.8m) </w:t>
-            </w:r>
-          </w:p>
-          <w:p>
-            <w:pPr>
-              <w:pStyle w:val="20"/>
-              <w:numPr>
-                <w:ilvl w:val="0"/>
-                <w:numId w:val="9"/>
-              </w:numPr>
-              <w:spacing w:after="0" w:line="360" w:lineRule="auto"/>
-              <w:ind w:left="-220" w:leftChars="-100" w:firstLine="0"/>
-              <w:jc w:val="both"/>
-              <w:rPr>
-                <w:rFonts w:ascii="Times New Roman" w:hAnsi="Times New Roman"/>
-                <w:spacing w:val="-1"/>
-                <w:sz w:val="26"/>
-                <w:szCs w:val="26"/>
-              </w:rPr>
-            </w:pPr>
-            <w:r>
-              <w:rPr>
-                <w:rFonts w:ascii="Times New Roman" w:hAnsi="Times New Roman"/>
-                <w:spacing w:val="-1"/>
-                <w:sz w:val="26"/>
-                <w:szCs w:val="26"/>
-              </w:rPr>
-              <w:t xml:space="preserve">Catwalk theo kích thước tiêu chuẩn </w:t>
-            </w:r>
-          </w:p>
-          <w:p>
-            <w:pPr>
-              <w:pStyle w:val="20"/>
-              <w:numPr>
-                <w:ilvl w:val="0"/>
-                <w:numId w:val="9"/>
-              </w:numPr>
-              <w:spacing w:after="0" w:line="360" w:lineRule="auto"/>
-              <w:ind w:left="-220" w:leftChars="-100" w:firstLine="0"/>
-              <w:jc w:val="both"/>
-              <w:rPr>
-                <w:rFonts w:ascii="Times New Roman" w:hAnsi="Times New Roman"/>
-                <w:spacing w:val="-1"/>
-                <w:sz w:val="26"/>
-                <w:szCs w:val="26"/>
-              </w:rPr>
-            </w:pPr>
-            <w:r>
-              <w:rPr>
-                <w:rFonts w:ascii="Times New Roman" w:hAnsi="Times New Roman"/>
-                <w:spacing w:val="-1"/>
-                <w:sz w:val="26"/>
-                <w:szCs w:val="26"/>
-              </w:rPr>
-              <w:t xml:space="preserve">Hệ thống âm thanh - ánh sáng tiêu chuẩn </w:t>
-            </w:r>
-          </w:p>
-          <w:p>
-            <w:pPr>
-              <w:pStyle w:val="20"/>
-              <w:numPr>
-                <w:ilvl w:val="0"/>
-                <w:numId w:val="9"/>
-              </w:numPr>
-              <w:spacing w:after="0" w:line="360" w:lineRule="auto"/>
-              <w:ind w:left="-220" w:leftChars="-100" w:firstLine="0"/>
-              <w:jc w:val="both"/>
-              <w:rPr>
-                <w:rFonts w:ascii="Times New Roman" w:hAnsi="Times New Roman"/>
-                <w:spacing w:val="-1"/>
-                <w:sz w:val="26"/>
-                <w:szCs w:val="26"/>
-              </w:rPr>
-            </w:pPr>
-            <w:r>
-              <w:rPr>
-                <w:rFonts w:ascii="Times New Roman" w:hAnsi="Times New Roman"/>
-                <w:spacing w:val="-1"/>
-                <w:sz w:val="26"/>
-                <w:szCs w:val="26"/>
-              </w:rPr>
-              <w:t xml:space="preserve">Phông màn sân khấu tiêu chuẩn </w:t>
-            </w:r>
-          </w:p>
-          <w:p>
-            <w:pPr>
-              <w:pStyle w:val="20"/>
-              <w:numPr>
-                <w:ilvl w:val="0"/>
-                <w:numId w:val="9"/>
-              </w:numPr>
-              <w:spacing w:after="0" w:line="360" w:lineRule="auto"/>
-              <w:ind w:left="-220" w:leftChars="-100" w:firstLine="0"/>
-              <w:jc w:val="both"/>
-              <w:rPr>
-                <w:rFonts w:ascii="Times New Roman" w:hAnsi="Times New Roman"/>
-                <w:spacing w:val="-1"/>
-                <w:sz w:val="26"/>
-                <w:szCs w:val="26"/>
-              </w:rPr>
-            </w:pPr>
-            <w:r>
-              <w:rPr>
-                <w:rFonts w:ascii="Times New Roman" w:hAnsi="Times New Roman"/>
-                <w:spacing w:val="-1"/>
-                <w:sz w:val="26"/>
-                <w:szCs w:val="26"/>
-              </w:rPr>
-              <w:t xml:space="preserve">Tên CD &amp; CR ( Chữ cái ) </w:t>
-            </w:r>
-          </w:p>
-          <w:p>
-            <w:pPr>
-              <w:pStyle w:val="20"/>
-              <w:numPr>
-                <w:ilvl w:val="0"/>
-                <w:numId w:val="9"/>
-              </w:numPr>
-              <w:spacing w:after="0" w:line="360" w:lineRule="auto"/>
-              <w:ind w:left="-220" w:leftChars="-100" w:firstLine="0"/>
-              <w:jc w:val="both"/>
-              <w:rPr>
-                <w:rFonts w:ascii="Times New Roman" w:hAnsi="Times New Roman"/>
-                <w:spacing w:val="-1"/>
-                <w:sz w:val="26"/>
-                <w:szCs w:val="26"/>
-              </w:rPr>
-            </w:pPr>
-            <w:r>
-              <w:rPr>
-                <w:rFonts w:ascii="Times New Roman" w:hAnsi="Times New Roman"/>
-                <w:spacing w:val="-1"/>
-                <w:sz w:val="26"/>
-                <w:szCs w:val="26"/>
-              </w:rPr>
-              <w:t xml:space="preserve">Trang trí bàn lễ tân đón khách tiêu chuẩn </w:t>
-            </w:r>
-          </w:p>
-          <w:p>
-            <w:pPr>
-              <w:pStyle w:val="20"/>
-              <w:numPr>
-                <w:ilvl w:val="0"/>
-                <w:numId w:val="9"/>
-              </w:numPr>
-              <w:spacing w:after="0" w:line="360" w:lineRule="auto"/>
-              <w:ind w:left="-220" w:leftChars="-100" w:firstLine="0"/>
-              <w:jc w:val="both"/>
-              <w:rPr>
-                <w:rFonts w:ascii="Times New Roman" w:hAnsi="Times New Roman"/>
-                <w:spacing w:val="-1"/>
-                <w:sz w:val="26"/>
-                <w:szCs w:val="26"/>
-              </w:rPr>
-            </w:pPr>
-            <w:r>
-              <w:rPr>
-                <w:rFonts w:ascii="Times New Roman" w:hAnsi="Times New Roman"/>
-                <w:spacing w:val="-1"/>
-                <w:sz w:val="26"/>
-                <w:szCs w:val="26"/>
-              </w:rPr>
-              <w:t xml:space="preserve">Thùng đựng tiền mừng </w:t>
-            </w:r>
-          </w:p>
-          <w:p>
-            <w:pPr>
-              <w:pStyle w:val="20"/>
-              <w:numPr>
-                <w:ilvl w:val="0"/>
-                <w:numId w:val="9"/>
-              </w:numPr>
-              <w:spacing w:after="0" w:line="360" w:lineRule="auto"/>
-              <w:ind w:left="-220" w:leftChars="-100" w:firstLine="0"/>
-              <w:jc w:val="both"/>
-              <w:rPr>
-                <w:rFonts w:ascii="Times New Roman" w:hAnsi="Times New Roman"/>
-                <w:spacing w:val="-1"/>
-                <w:sz w:val="26"/>
-                <w:szCs w:val="26"/>
-              </w:rPr>
-            </w:pPr>
-            <w:r>
-              <w:rPr>
-                <w:rFonts w:ascii="Times New Roman" w:hAnsi="Times New Roman"/>
-                <w:spacing w:val="-1"/>
-                <w:sz w:val="26"/>
-                <w:szCs w:val="26"/>
-              </w:rPr>
-              <w:t xml:space="preserve">Liễn ký tên lưu niệm, bút </w:t>
-            </w:r>
-          </w:p>
-          <w:p>
-            <w:pPr>
-              <w:pStyle w:val="20"/>
-              <w:numPr>
-                <w:ilvl w:val="0"/>
-                <w:numId w:val="9"/>
-              </w:numPr>
-              <w:spacing w:after="0" w:line="360" w:lineRule="auto"/>
-              <w:ind w:left="-220" w:leftChars="-100" w:firstLine="0"/>
-              <w:jc w:val="both"/>
-              <w:rPr>
-                <w:rFonts w:ascii="Times New Roman" w:hAnsi="Times New Roman"/>
-                <w:spacing w:val="-1"/>
-                <w:sz w:val="26"/>
-                <w:szCs w:val="26"/>
-              </w:rPr>
-            </w:pPr>
-            <w:r>
-              <w:rPr>
-                <w:rFonts w:ascii="Times New Roman" w:hAnsi="Times New Roman"/>
-                <w:spacing w:val="-1"/>
-                <w:sz w:val="26"/>
-                <w:szCs w:val="26"/>
-              </w:rPr>
-              <w:t xml:space="preserve">Trang trí hoa tươi bàn tiệc tiêu chuẩn </w:t>
-            </w:r>
-          </w:p>
-          <w:p>
-            <w:pPr>
-              <w:pStyle w:val="20"/>
-              <w:numPr>
-                <w:ilvl w:val="0"/>
-                <w:numId w:val="9"/>
-              </w:numPr>
-              <w:spacing w:after="0" w:line="360" w:lineRule="auto"/>
-              <w:ind w:left="-220" w:leftChars="-100" w:firstLine="0"/>
-              <w:jc w:val="both"/>
-              <w:rPr>
-                <w:rFonts w:ascii="Times New Roman" w:hAnsi="Times New Roman"/>
-                <w:spacing w:val="-1"/>
-                <w:sz w:val="26"/>
-                <w:szCs w:val="26"/>
-              </w:rPr>
-            </w:pPr>
-            <w:r>
-              <w:rPr>
-                <w:rFonts w:ascii="Times New Roman" w:hAnsi="Times New Roman"/>
-                <w:spacing w:val="-1"/>
-                <w:sz w:val="26"/>
-                <w:szCs w:val="26"/>
-              </w:rPr>
-              <w:t xml:space="preserve">Phòng trang điểm CD-CR. </w:t>
-            </w:r>
-          </w:p>
-          <w:p>
-            <w:pPr>
-              <w:pStyle w:val="20"/>
-              <w:numPr>
-                <w:ilvl w:val="0"/>
-                <w:numId w:val="9"/>
-              </w:numPr>
-              <w:spacing w:after="0" w:line="360" w:lineRule="auto"/>
-              <w:ind w:left="-220" w:leftChars="-100" w:firstLine="0"/>
-              <w:jc w:val="both"/>
-              <w:rPr>
-                <w:rFonts w:ascii="Times New Roman" w:hAnsi="Times New Roman"/>
-                <w:spacing w:val="-1"/>
-                <w:sz w:val="26"/>
-                <w:szCs w:val="26"/>
-              </w:rPr>
-            </w:pPr>
-            <w:r>
-              <w:rPr>
-                <w:rFonts w:ascii="Times New Roman" w:hAnsi="Times New Roman"/>
-                <w:spacing w:val="-1"/>
-                <w:sz w:val="26"/>
-                <w:szCs w:val="26"/>
-              </w:rPr>
-              <w:t>Lễ tân hướng dẫn khách</w:t>
-            </w:r>
-          </w:p>
-          <w:p>
-            <w:pPr>
-              <w:pStyle w:val="20"/>
-              <w:numPr>
-                <w:ilvl w:val="0"/>
-                <w:numId w:val="9"/>
-              </w:numPr>
-              <w:spacing w:after="0" w:line="360" w:lineRule="auto"/>
-              <w:ind w:left="-220" w:leftChars="-100" w:firstLine="0"/>
-              <w:jc w:val="both"/>
-              <w:rPr>
-                <w:rFonts w:ascii="Times New Roman" w:hAnsi="Times New Roman"/>
-                <w:spacing w:val="-1"/>
-                <w:sz w:val="26"/>
-                <w:szCs w:val="26"/>
-              </w:rPr>
-            </w:pPr>
-            <w:r>
-              <w:rPr>
-                <w:rFonts w:ascii="Times New Roman" w:hAnsi="Times New Roman"/>
-                <w:spacing w:val="-1"/>
-                <w:sz w:val="26"/>
-                <w:szCs w:val="26"/>
-              </w:rPr>
-              <w:t xml:space="preserve">Trang trí bục lối đi lên sân khấu (gồm: hoa thạch thảo trắng + đèn tuyết) </w:t>
-            </w:r>
-          </w:p>
-          <w:p>
-            <w:pPr>
-              <w:pStyle w:val="20"/>
-              <w:numPr>
-                <w:ilvl w:val="0"/>
-                <w:numId w:val="9"/>
-              </w:numPr>
-              <w:spacing w:after="0" w:line="360" w:lineRule="auto"/>
-              <w:ind w:left="-220" w:leftChars="-100" w:firstLine="0"/>
-              <w:jc w:val="both"/>
-              <w:rPr>
-                <w:rFonts w:ascii="Times New Roman" w:hAnsi="Times New Roman"/>
-                <w:spacing w:val="-1"/>
-                <w:sz w:val="26"/>
-                <w:szCs w:val="26"/>
-              </w:rPr>
-            </w:pPr>
-            <w:r>
-              <w:rPr>
-                <w:rFonts w:ascii="Times New Roman" w:hAnsi="Times New Roman"/>
-                <w:spacing w:val="-1"/>
-                <w:sz w:val="26"/>
-                <w:szCs w:val="26"/>
-              </w:rPr>
-              <w:t xml:space="preserve">Nước ngọt, nước suối suốt tiệc 2.5h </w:t>
-            </w:r>
-          </w:p>
-          <w:p>
-            <w:pPr>
-              <w:pStyle w:val="20"/>
-              <w:numPr>
-                <w:ilvl w:val="0"/>
-                <w:numId w:val="9"/>
-              </w:numPr>
-              <w:spacing w:after="0" w:line="360" w:lineRule="auto"/>
-              <w:ind w:left="-220" w:leftChars="-100" w:firstLine="0"/>
-              <w:jc w:val="both"/>
-              <w:rPr>
-                <w:rFonts w:ascii="Times New Roman" w:hAnsi="Times New Roman"/>
-                <w:spacing w:val="-1"/>
-                <w:sz w:val="26"/>
-                <w:szCs w:val="26"/>
-              </w:rPr>
-            </w:pPr>
-            <w:r>
-              <w:rPr>
-                <w:rFonts w:ascii="Times New Roman" w:hAnsi="Times New Roman"/>
-                <w:spacing w:val="-1"/>
-                <w:sz w:val="26"/>
-                <w:szCs w:val="26"/>
-              </w:rPr>
-              <w:t xml:space="preserve">Pháo hoa kim tuyến 2 lần (1 lần/2 viên) </w:t>
-            </w:r>
-          </w:p>
-          <w:p>
-            <w:pPr>
-              <w:pStyle w:val="20"/>
-              <w:numPr>
-                <w:ilvl w:val="0"/>
-                <w:numId w:val="9"/>
-              </w:numPr>
-              <w:spacing w:after="0" w:line="360" w:lineRule="auto"/>
-              <w:ind w:left="-220" w:leftChars="-100" w:firstLine="0"/>
-              <w:jc w:val="both"/>
-              <w:rPr>
-                <w:rFonts w:ascii="Times New Roman" w:hAnsi="Times New Roman"/>
-                <w:spacing w:val="-1"/>
-                <w:sz w:val="26"/>
-                <w:szCs w:val="26"/>
-              </w:rPr>
-            </w:pPr>
-            <w:r>
-              <w:rPr>
-                <w:rFonts w:ascii="Times New Roman" w:hAnsi="Times New Roman"/>
-                <w:spacing w:val="-1"/>
-                <w:sz w:val="26"/>
-                <w:szCs w:val="26"/>
-              </w:rPr>
-              <w:t xml:space="preserve">1 người dẫn chương trình nghi lễ ( Tiếng Việt ) </w:t>
-            </w:r>
-          </w:p>
-          <w:p>
-            <w:pPr>
-              <w:pStyle w:val="20"/>
-              <w:numPr>
-                <w:ilvl w:val="0"/>
-                <w:numId w:val="9"/>
-              </w:numPr>
-              <w:spacing w:after="0" w:line="360" w:lineRule="auto"/>
-              <w:ind w:left="-220" w:leftChars="-100" w:firstLine="0"/>
-              <w:jc w:val="both"/>
-              <w:rPr>
-                <w:rFonts w:ascii="Times New Roman" w:hAnsi="Times New Roman"/>
-                <w:spacing w:val="-1"/>
-                <w:sz w:val="26"/>
-                <w:szCs w:val="26"/>
-              </w:rPr>
-            </w:pPr>
-            <w:r>
-              <w:rPr>
-                <w:rFonts w:ascii="Times New Roman" w:hAnsi="Times New Roman"/>
-                <w:spacing w:val="-1"/>
-                <w:sz w:val="26"/>
-                <w:szCs w:val="26"/>
-              </w:rPr>
-              <w:t xml:space="preserve">Trang trí hoa tươi tháp bánh, tháp ly tiêu chuẩn </w:t>
-            </w:r>
-          </w:p>
-          <w:p>
-            <w:pPr>
-              <w:pStyle w:val="20"/>
-              <w:numPr>
-                <w:ilvl w:val="0"/>
-                <w:numId w:val="9"/>
-              </w:numPr>
-              <w:spacing w:after="0" w:line="360" w:lineRule="auto"/>
-              <w:ind w:left="-220" w:leftChars="-100" w:firstLine="0"/>
-              <w:jc w:val="both"/>
-              <w:rPr>
-                <w:rFonts w:ascii="Times New Roman" w:hAnsi="Times New Roman"/>
-                <w:spacing w:val="-1"/>
-                <w:sz w:val="26"/>
-                <w:szCs w:val="26"/>
-              </w:rPr>
-            </w:pPr>
-            <w:r>
-              <w:rPr>
-                <w:rFonts w:ascii="Times New Roman" w:hAnsi="Times New Roman"/>
-                <w:spacing w:val="-1"/>
-                <w:sz w:val="26"/>
-                <w:szCs w:val="26"/>
-              </w:rPr>
-              <w:t xml:space="preserve">Tháp ly và 2 chai champage, đá khói </w:t>
-            </w:r>
-          </w:p>
-          <w:p>
-            <w:pPr>
-              <w:pStyle w:val="20"/>
-              <w:numPr>
-                <w:ilvl w:val="0"/>
-                <w:numId w:val="9"/>
-              </w:numPr>
-              <w:spacing w:after="0" w:line="360" w:lineRule="auto"/>
-              <w:ind w:left="-220" w:leftChars="-100" w:firstLine="0"/>
-              <w:jc w:val="both"/>
-              <w:rPr>
-                <w:rFonts w:ascii="Times New Roman" w:hAnsi="Times New Roman"/>
-                <w:spacing w:val="-1"/>
-                <w:sz w:val="26"/>
-                <w:szCs w:val="26"/>
-              </w:rPr>
-            </w:pPr>
-            <w:r>
-              <w:rPr>
-                <w:rFonts w:ascii="Times New Roman" w:hAnsi="Times New Roman"/>
-                <w:spacing w:val="-1"/>
-                <w:sz w:val="26"/>
-                <w:szCs w:val="26"/>
-              </w:rPr>
-              <w:t>Bánh cưới 5 tầng giả và trang trí tiêu chuẩn</w:t>
-            </w:r>
-          </w:p>
-          <w:p>
-            <w:pPr>
-              <w:pStyle w:val="20"/>
-              <w:numPr>
-                <w:ilvl w:val="0"/>
-                <w:numId w:val="9"/>
-              </w:numPr>
-              <w:spacing w:after="0" w:line="360" w:lineRule="auto"/>
-              <w:ind w:left="-220" w:leftChars="-100" w:firstLine="0"/>
-              <w:jc w:val="both"/>
-              <w:rPr>
-                <w:rFonts w:ascii="Times New Roman" w:hAnsi="Times New Roman"/>
-                <w:spacing w:val="-1"/>
-                <w:sz w:val="26"/>
-                <w:szCs w:val="26"/>
-              </w:rPr>
-            </w:pPr>
-            <w:r>
-              <w:rPr>
-                <w:rFonts w:ascii="Times New Roman" w:hAnsi="Times New Roman"/>
-                <w:spacing w:val="-1"/>
-                <w:sz w:val="26"/>
-                <w:szCs w:val="26"/>
-              </w:rPr>
-              <w:t xml:space="preserve">Bia Tiger chai nâu nhỏ (330ml) trong tiệc 2.5 giờ </w:t>
-            </w:r>
-          </w:p>
-          <w:p>
-            <w:pPr>
-              <w:pStyle w:val="20"/>
-              <w:numPr>
-                <w:ilvl w:val="0"/>
-                <w:numId w:val="9"/>
-              </w:numPr>
-              <w:spacing w:after="0" w:line="360" w:lineRule="auto"/>
-              <w:ind w:left="-220" w:leftChars="-100" w:firstLine="0"/>
-              <w:jc w:val="both"/>
-              <w:rPr>
-                <w:rFonts w:ascii="Times New Roman" w:hAnsi="Times New Roman"/>
-                <w:spacing w:val="-1"/>
-                <w:sz w:val="26"/>
-                <w:szCs w:val="26"/>
-              </w:rPr>
-            </w:pPr>
-            <w:r>
-              <w:rPr>
-                <w:rFonts w:ascii="Times New Roman" w:hAnsi="Times New Roman"/>
-                <w:spacing w:val="-1"/>
-                <w:sz w:val="26"/>
-                <w:szCs w:val="26"/>
-              </w:rPr>
-              <w:t xml:space="preserve">Tặng voucher gói trang trí hoa tươi của Queen Plaza Kỳ Hòa trị giá 10.000.000VNĐ </w:t>
-            </w:r>
-          </w:p>
-          <w:p>
-            <w:pPr>
-              <w:pStyle w:val="20"/>
-              <w:numPr>
-                <w:ilvl w:val="0"/>
-                <w:numId w:val="9"/>
-              </w:numPr>
-              <w:spacing w:after="0" w:line="360" w:lineRule="auto"/>
-              <w:ind w:left="-220" w:leftChars="-100" w:firstLine="0"/>
-              <w:jc w:val="both"/>
-              <w:rPr>
-                <w:rFonts w:ascii="Times New Roman" w:hAnsi="Times New Roman"/>
-                <w:spacing w:val="-1"/>
-                <w:sz w:val="26"/>
-                <w:szCs w:val="26"/>
-              </w:rPr>
-            </w:pPr>
-            <w:r>
-              <w:rPr>
-                <w:rFonts w:ascii="Times New Roman" w:hAnsi="Times New Roman"/>
-                <w:spacing w:val="-1"/>
-                <w:sz w:val="26"/>
-                <w:szCs w:val="26"/>
-              </w:rPr>
-              <w:t xml:space="preserve">Ăn nhẹ trước tiệc cho Bố Mẹ, Cô Dâu – Chủ Rể (súp, cơm/mì): 10 người </w:t>
-            </w:r>
-          </w:p>
-          <w:p>
-            <w:pPr>
-              <w:pStyle w:val="20"/>
+              <w:pStyle w:val="18"/>
               <w:numPr>
                 <w:ilvl w:val="0"/>
                 <w:numId w:val="9"/>
@@ -6176,8 +5076,9 @@
               <w:autoSpaceDE w:val="0"/>
               <w:autoSpaceDN w:val="0"/>
               <w:adjustRightInd w:val="0"/>
-              <w:spacing w:before="57" w:after="0" w:line="288" w:lineRule="auto"/>
+              <w:spacing w:before="120" w:after="120" w:line="360" w:lineRule="auto"/>
               <w:ind w:left="-220" w:leftChars="-100" w:right="-96" w:firstLine="0"/>
+              <w:jc w:val="both"/>
               <w:textAlignment w:val="center"/>
               <w:rPr>
                 <w:rFonts w:ascii="Times New Roman" w:hAnsi="Times New Roman"/>
@@ -6189,11 +5090,12 @@
             <w:r>
               <w:rPr>
                 <w:rFonts w:ascii="Times New Roman" w:hAnsi="Times New Roman"/>
-                <w:spacing w:val="-1"/>
+                <w:b/>
                 <w:sz w:val="26"/>
                 <w:szCs w:val="26"/>
+                <w:lang w:val="fr-FR"/>
               </w:rPr>
-              <w:t>20 bàn tặng thêm 2 bàn tiệc chính thức (CTKM thêm áp dụng 01/09/2025 – 30/03/2026)</w:t>
+              <w:t>{DS_KhuyenMai}</w:t>
             </w:r>
           </w:p>
         </w:tc>

</xml_diff>